<commit_message>
Lab 03 full task completed!!
</commit_message>
<xml_diff>
--- a/Lab3/LAB3.docx
+++ b/Lab3/LAB3.docx
@@ -2,7 +2,192 @@
 <file path=word/document.xml><?xml version="1.0" encoding="utf-8"?>
 <w:document xmlns:wpc="http://schemas.microsoft.com/office/word/2010/wordprocessingCanvas" xmlns:cx="http://schemas.microsoft.com/office/drawing/2014/chartex" xmlns:mc="http://schemas.openxmlformats.org/markup-compatibility/2006" xmlns:o="urn:schemas-microsoft-com:office:office" xmlns:r="http://schemas.openxmlformats.org/officeDocument/2006/relationships" xmlns:m="http://schemas.openxmlformats.org/officeDocument/2006/math" xmlns:v="urn:schemas-microsoft-com:vml" xmlns:wp14="http://schemas.microsoft.com/office/word/2010/wordprocessingDrawing" xmlns:wp="http://schemas.openxmlformats.org/drawingml/2006/wordprocessingDrawing" xmlns:w10="urn:schemas-microsoft-com:office:word" xmlns:w="http://schemas.openxmlformats.org/wordprocessingml/2006/main" xmlns:w14="http://schemas.microsoft.com/office/word/2010/wordml" xmlns:w15="http://schemas.microsoft.com/office/word/2012/wordml" xmlns:w16se="http://schemas.microsoft.com/office/word/2015/wordml/symex" xmlns:wpg="http://schemas.microsoft.com/office/word/2010/wordprocessingGroup" xmlns:wpi="http://schemas.microsoft.com/office/word/2010/wordprocessingInk" xmlns:wne="http://schemas.microsoft.com/office/word/2006/wordml" xmlns:wps="http://schemas.microsoft.com/office/word/2010/wordprocessingShape" mc:Ignorable="w14 w15 w16se wp14">
   <w:body>
-    <w:p/>
+    <w:p>
+      <w:r>
+        <w:rPr>
+          <w:noProof/>
+        </w:rPr>
+        <mc:AlternateContent>
+          <mc:Choice Requires="wps">
+            <w:drawing>
+              <wp:anchor distT="45720" distB="45720" distL="114300" distR="114300" simplePos="0" relativeHeight="251681792" behindDoc="0" locked="0" layoutInCell="1" allowOverlap="1" wp14:anchorId="3AA5540F" wp14:editId="7396A022">
+                <wp:simplePos x="0" y="0"/>
+                <wp:positionH relativeFrom="margin">
+                  <wp:align>right</wp:align>
+                </wp:positionH>
+                <wp:positionV relativeFrom="paragraph">
+                  <wp:posOffset>0</wp:posOffset>
+                </wp:positionV>
+                <wp:extent cx="2360930" cy="1404620"/>
+                <wp:effectExtent l="0" t="0" r="22860" b="13970"/>
+                <wp:wrapSquare wrapText="bothSides"/>
+                <wp:docPr id="2" name="Text Box 2"/>
+                <wp:cNvGraphicFramePr>
+                  <a:graphicFrameLocks xmlns:a="http://schemas.openxmlformats.org/drawingml/2006/main"/>
+                </wp:cNvGraphicFramePr>
+                <a:graphic xmlns:a="http://schemas.openxmlformats.org/drawingml/2006/main">
+                  <a:graphicData uri="http://schemas.microsoft.com/office/word/2010/wordprocessingShape">
+                    <wps:wsp>
+                      <wps:cNvSpPr txBox="1">
+                        <a:spLocks noChangeArrowheads="1"/>
+                      </wps:cNvSpPr>
+                      <wps:spPr bwMode="auto">
+                        <a:xfrm>
+                          <a:off x="0" y="0"/>
+                          <a:ext cx="2360930" cy="1404620"/>
+                        </a:xfrm>
+                        <a:prstGeom prst="rect">
+                          <a:avLst/>
+                        </a:prstGeom>
+                        <a:solidFill>
+                          <a:srgbClr val="FFFFFF"/>
+                        </a:solidFill>
+                        <a:ln w="9525">
+                          <a:solidFill>
+                            <a:srgbClr val="000000"/>
+                          </a:solidFill>
+                          <a:miter lim="800000"/>
+                          <a:headEnd/>
+                          <a:tailEnd/>
+                        </a:ln>
+                      </wps:spPr>
+                      <wps:txbx>
+                        <w:txbxContent>
+                          <w:p>
+                            <w:r>
+                              <w:t>Step:01</w:t>
+                            </w:r>
+                          </w:p>
+                        </w:txbxContent>
+                      </wps:txbx>
+                      <wps:bodyPr rot="0" vert="horz" wrap="square" lIns="91440" tIns="45720" rIns="91440" bIns="45720" anchor="t" anchorCtr="0">
+                        <a:spAutoFit/>
+                      </wps:bodyPr>
+                    </wps:wsp>
+                  </a:graphicData>
+                </a:graphic>
+                <wp14:sizeRelH relativeFrom="margin">
+                  <wp14:pctWidth>40000</wp14:pctWidth>
+                </wp14:sizeRelH>
+                <wp14:sizeRelV relativeFrom="margin">
+                  <wp14:pctHeight>20000</wp14:pctHeight>
+                </wp14:sizeRelV>
+              </wp:anchor>
+            </w:drawing>
+          </mc:Choice>
+          <mc:Fallback>
+            <w:pict>
+              <v:shapetype w14:anchorId="3AA5540F" id="_x0000_t202" coordsize="21600,21600" o:spt="202" path="m,l,21600r21600,l21600,xe">
+                <v:stroke joinstyle="miter"/>
+                <v:path gradientshapeok="t" o:connecttype="rect"/>
+              </v:shapetype>
+              <v:shape id="Text Box 2" o:spid="_x0000_s1026" type="#_x0000_t202" style="position:absolute;margin-left:134.7pt;margin-top:0;width:185.9pt;height:110.6pt;z-index:251681792;visibility:visible;mso-wrap-style:square;mso-width-percent:400;mso-height-percent:200;mso-wrap-distance-left:9pt;mso-wrap-distance-top:3.6pt;mso-wrap-distance-right:9pt;mso-wrap-distance-bottom:3.6pt;mso-position-horizontal:right;mso-position-horizontal-relative:margin;mso-position-vertical:absolute;mso-position-vertical-relative:text;mso-width-percent:400;mso-height-percent:200;mso-width-relative:margin;mso-height-relative:margin;v-text-anchor:top" o:gfxdata="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">
+                <v:textbox style="mso-fit-shape-to-text:t">
+                  <w:txbxContent>
+                    <w:p>
+                      <w:r>
+                        <w:t>Step:01</w:t>
+                      </w:r>
+                    </w:p>
+                  </w:txbxContent>
+                </v:textbox>
+                <w10:wrap type="square" anchorx="margin"/>
+              </v:shape>
+            </w:pict>
+          </mc:Fallback>
+        </mc:AlternateContent>
+      </w:r>
+      <w:r>
+        <w:rPr>
+          <w:noProof/>
+        </w:rPr>
+        <mc:AlternateContent>
+          <mc:Choice Requires="wps">
+            <w:drawing>
+              <wp:anchor distT="45720" distB="45720" distL="114300" distR="114300" simplePos="0" relativeHeight="251679744" behindDoc="0" locked="0" layoutInCell="1" allowOverlap="1" wp14:anchorId="748A2CA3" wp14:editId="73DF65D1">
+                <wp:simplePos x="0" y="0"/>
+                <wp:positionH relativeFrom="margin">
+                  <wp:align>left</wp:align>
+                </wp:positionH>
+                <wp:positionV relativeFrom="paragraph">
+                  <wp:posOffset>0</wp:posOffset>
+                </wp:positionV>
+                <wp:extent cx="2360930" cy="1404620"/>
+                <wp:effectExtent l="0" t="0" r="22860" b="20955"/>
+                <wp:wrapSquare wrapText="bothSides"/>
+                <wp:docPr id="217" name="Text Box 2"/>
+                <wp:cNvGraphicFramePr>
+                  <a:graphicFrameLocks xmlns:a="http://schemas.openxmlformats.org/drawingml/2006/main"/>
+                </wp:cNvGraphicFramePr>
+                <a:graphic xmlns:a="http://schemas.openxmlformats.org/drawingml/2006/main">
+                  <a:graphicData uri="http://schemas.microsoft.com/office/word/2010/wordprocessingShape">
+                    <wps:wsp>
+                      <wps:cNvSpPr txBox="1">
+                        <a:spLocks noChangeArrowheads="1"/>
+                      </wps:cNvSpPr>
+                      <wps:spPr bwMode="auto">
+                        <a:xfrm>
+                          <a:off x="0" y="0"/>
+                          <a:ext cx="2360930" cy="1404620"/>
+                        </a:xfrm>
+                        <a:prstGeom prst="rect">
+                          <a:avLst/>
+                        </a:prstGeom>
+                        <a:solidFill>
+                          <a:srgbClr val="FFFFFF"/>
+                        </a:solidFill>
+                        <a:ln w="9525">
+                          <a:solidFill>
+                            <a:srgbClr val="000000"/>
+                          </a:solidFill>
+                          <a:miter lim="800000"/>
+                          <a:headEnd/>
+                          <a:tailEnd/>
+                        </a:ln>
+                      </wps:spPr>
+                      <wps:txbx>
+                        <w:txbxContent>
+                          <w:p>
+                            <w:r>
+                              <w:t>Initialization Setup</w:t>
+                            </w:r>
+                          </w:p>
+                        </w:txbxContent>
+                      </wps:txbx>
+                      <wps:bodyPr rot="0" vert="horz" wrap="square" lIns="91440" tIns="45720" rIns="91440" bIns="45720" anchor="t" anchorCtr="0">
+                        <a:spAutoFit/>
+                      </wps:bodyPr>
+                    </wps:wsp>
+                  </a:graphicData>
+                </a:graphic>
+                <wp14:sizeRelH relativeFrom="margin">
+                  <wp14:pctWidth>40000</wp14:pctWidth>
+                </wp14:sizeRelH>
+                <wp14:sizeRelV relativeFrom="margin">
+                  <wp14:pctHeight>20000</wp14:pctHeight>
+                </wp14:sizeRelV>
+              </wp:anchor>
+            </w:drawing>
+          </mc:Choice>
+          <mc:Fallback>
+            <w:pict>
+              <v:shape w14:anchorId="748A2CA3" id="_x0000_s1027" type="#_x0000_t202" style="position:absolute;margin-left:0;margin-top:0;width:185.9pt;height:110.6pt;z-index:251679744;visibility:visible;mso-wrap-style:square;mso-width-percent:400;mso-height-percent:200;mso-wrap-distance-left:9pt;mso-wrap-distance-top:3.6pt;mso-wrap-distance-right:9pt;mso-wrap-distance-bottom:3.6pt;mso-position-horizontal:left;mso-position-horizontal-relative:margin;mso-position-vertical:absolute;mso-position-vertical-relative:text;mso-width-percent:400;mso-height-percent:200;mso-width-relative:margin;mso-height-relative:margin;v-text-anchor:top" o:gfxdata="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">
+                <v:textbox style="mso-fit-shape-to-text:t">
+                  <w:txbxContent>
+                    <w:p>
+                      <w:r>
+                        <w:t>Initialization Setup</w:t>
+                      </w:r>
+                    </w:p>
+                  </w:txbxContent>
+                </v:textbox>
+                <w10:wrap type="square" anchorx="margin"/>
+              </v:shape>
+            </w:pict>
+          </mc:Fallback>
+        </mc:AlternateContent>
+      </w:r>
+    </w:p>
     <w:p/>
     <w:p>
       <w:r>
@@ -12,7 +197,7 @@
         <mc:AlternateContent>
           <mc:Choice Requires="wps">
             <w:drawing>
-              <wp:anchor distT="0" distB="0" distL="114300" distR="114300" simplePos="0" relativeHeight="251659264" behindDoc="0" locked="0" layoutInCell="1" allowOverlap="1" wp14:anchorId="2B89105A" wp14:editId="44451214">
+              <wp:anchor distT="0" distB="0" distL="114300" distR="114300" simplePos="0" relativeHeight="251659264" behindDoc="0" locked="0" layoutInCell="1" allowOverlap="1" wp14:anchorId="49143412" wp14:editId="271E6BBC">
                 <wp:simplePos x="0" y="0"/>
                 <wp:positionH relativeFrom="margin">
                   <wp:posOffset>-716280</wp:posOffset>
@@ -77,7 +262,7 @@
           </mc:Choice>
           <mc:Fallback>
             <w:pict>
-              <v:roundrect w14:anchorId="638D46B5" id="Rounded Rectangle 7" o:spid="_x0000_s1026" style="position:absolute;margin-left:-56.4pt;margin-top:29.4pt;width:263.4pt;height:193.35pt;z-index:251659264;visibility:visible;mso-wrap-style:square;mso-width-percent:0;mso-wrap-distance-left:9pt;mso-wrap-distance-top:0;mso-wrap-distance-right:9pt;mso-wrap-distance-bottom:0;mso-position-horizontal:absolute;mso-position-horizontal-relative:margin;mso-position-vertical:absolute;mso-position-vertical-relative:text;mso-width-percent:0;mso-width-relative:margin;v-text-anchor:middle" arcsize="10923f" o:gfxdata="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" strokecolor="#1f4d78 [1604]" strokeweight="1pt">
+              <v:roundrect w14:anchorId="20DE6640" id="Rounded Rectangle 7" o:spid="_x0000_s1026" style="position:absolute;margin-left:-56.4pt;margin-top:29.4pt;width:263.4pt;height:193.35pt;z-index:251659264;visibility:visible;mso-wrap-style:square;mso-width-percent:0;mso-wrap-distance-left:9pt;mso-wrap-distance-top:0;mso-wrap-distance-right:9pt;mso-wrap-distance-bottom:0;mso-position-horizontal:absolute;mso-position-horizontal-relative:margin;mso-position-vertical:absolute;mso-position-vertical-relative:text;mso-width-percent:0;mso-width-relative:margin;v-text-anchor:middle" arcsize="10923f" o:gfxdata="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" strokecolor="#1f4d78 [1604]" strokeweight="1pt">
                 <v:fill r:id="rId5" o:title="" recolor="t" rotate="t" type="frame"/>
                 <v:stroke joinstyle="miter"/>
                 <w10:wrap anchorx="margin"/>
@@ -95,18 +280,18 @@
         <mc:AlternateContent>
           <mc:Choice Requires="wps">
             <w:drawing>
-              <wp:anchor distT="0" distB="0" distL="114300" distR="114300" simplePos="0" relativeHeight="251668480" behindDoc="0" locked="0" layoutInCell="1" allowOverlap="1" wp14:anchorId="3BE364E8" wp14:editId="1DA2FEEF">
+              <wp:anchor distT="0" distB="0" distL="114300" distR="114300" simplePos="0" relativeHeight="251666432" behindDoc="0" locked="0" layoutInCell="1" allowOverlap="1" wp14:anchorId="5517D2ED" wp14:editId="0E03C0D1">
                 <wp:simplePos x="0" y="0"/>
                 <wp:positionH relativeFrom="column">
-                  <wp:posOffset>3169920</wp:posOffset>
+                  <wp:posOffset>3116580</wp:posOffset>
                 </wp:positionH>
                 <wp:positionV relativeFrom="paragraph">
-                  <wp:posOffset>103505</wp:posOffset>
+                  <wp:posOffset>118745</wp:posOffset>
                 </wp:positionV>
-                <wp:extent cx="3421380" cy="2430780"/>
-                <wp:effectExtent l="0" t="0" r="26670" b="26670"/>
+                <wp:extent cx="3329940" cy="2453640"/>
+                <wp:effectExtent l="0" t="0" r="22860" b="22860"/>
                 <wp:wrapNone/>
-                <wp:docPr id="13" name="Rounded Rectangle 13"/>
+                <wp:docPr id="12" name="Rounded Rectangle 12"/>
                 <wp:cNvGraphicFramePr/>
                 <a:graphic xmlns:a="http://schemas.openxmlformats.org/drawingml/2006/main">
                   <a:graphicData uri="http://schemas.microsoft.com/office/word/2010/wordprocessingShape">
@@ -115,7 +300,7 @@
                       <wps:spPr>
                         <a:xfrm>
                           <a:off x="0" y="0"/>
-                          <a:ext cx="3421380" cy="2430780"/>
+                          <a:ext cx="3329940" cy="2453640"/>
                         </a:xfrm>
                         <a:prstGeom prst="roundRect">
                           <a:avLst/>
@@ -163,7 +348,7 @@
           </mc:Choice>
           <mc:Fallback>
             <w:pict>
-              <v:roundrect w14:anchorId="1ED2FA1E" id="Rounded Rectangle 13" o:spid="_x0000_s1026" style="position:absolute;margin-left:249.6pt;margin-top:8.15pt;width:269.4pt;height:191.4pt;z-index:251668480;visibility:visible;mso-wrap-style:square;mso-width-percent:0;mso-height-percent:0;mso-wrap-distance-left:9pt;mso-wrap-distance-top:0;mso-wrap-distance-right:9pt;mso-wrap-distance-bottom:0;mso-position-horizontal:absolute;mso-position-horizontal-relative:text;mso-position-vertical:absolute;mso-position-vertical-relative:text;mso-width-percent:0;mso-height-percent:0;mso-width-relative:margin;mso-height-relative:margin;v-text-anchor:middle" arcsize="10923f" o:gfxdata="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" strokecolor="#1f4d78 [1604]" strokeweight="1pt">
+              <v:roundrect w14:anchorId="67C9033E" id="Rounded Rectangle 12" o:spid="_x0000_s1026" style="position:absolute;margin-left:245.4pt;margin-top:9.35pt;width:262.2pt;height:193.2pt;z-index:251666432;visibility:visible;mso-wrap-style:square;mso-width-percent:0;mso-height-percent:0;mso-wrap-distance-left:9pt;mso-wrap-distance-top:0;mso-wrap-distance-right:9pt;mso-wrap-distance-bottom:0;mso-position-horizontal:absolute;mso-position-horizontal-relative:text;mso-position-vertical:absolute;mso-position-vertical-relative:text;mso-width-percent:0;mso-height-percent:0;mso-width-relative:margin;mso-height-relative:margin;v-text-anchor:middle" arcsize="10923f" o:gfxdata="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" strokecolor="#1f4d78 [1604]" strokeweight="1pt">
                 <v:fill r:id="rId7" o:title="" recolor="t" rotate="t" type="frame"/>
                 <v:stroke joinstyle="miter"/>
               </v:roundrect>
@@ -186,13 +371,13 @@
         <mc:AlternateContent>
           <mc:Choice Requires="wps">
             <w:drawing>
-              <wp:anchor distT="0" distB="0" distL="114300" distR="114300" simplePos="0" relativeHeight="251669504" behindDoc="0" locked="0" layoutInCell="1" allowOverlap="1" wp14:anchorId="61280BAB" wp14:editId="5854780F">
+              <wp:anchor distT="0" distB="0" distL="114300" distR="114300" simplePos="0" relativeHeight="251669504" behindDoc="0" locked="0" layoutInCell="1" allowOverlap="1" wp14:anchorId="4C0B63CD" wp14:editId="6C007EAB">
                 <wp:simplePos x="0" y="0"/>
                 <wp:positionH relativeFrom="page">
-                  <wp:posOffset>3939540</wp:posOffset>
+                  <wp:posOffset>4001770</wp:posOffset>
                 </wp:positionH>
                 <wp:positionV relativeFrom="paragraph">
-                  <wp:posOffset>1350010</wp:posOffset>
+                  <wp:posOffset>3009900</wp:posOffset>
                 </wp:positionV>
                 <wp:extent cx="3589020" cy="2264410"/>
                 <wp:effectExtent l="0" t="0" r="11430" b="21590"/>
@@ -254,7 +439,7 @@
           </mc:Choice>
           <mc:Fallback>
             <w:pict>
-              <v:roundrect w14:anchorId="7D19A647" id="Rounded Rectangle 14" o:spid="_x0000_s1026" style="position:absolute;margin-left:310.2pt;margin-top:106.3pt;width:282.6pt;height:178.3pt;z-index:251669504;visibility:visible;mso-wrap-style:square;mso-width-percent:0;mso-height-percent:0;mso-wrap-distance-left:9pt;mso-wrap-distance-top:0;mso-wrap-distance-right:9pt;mso-wrap-distance-bottom:0;mso-position-horizontal:absolute;mso-position-horizontal-relative:page;mso-position-vertical:absolute;mso-position-vertical-relative:text;mso-width-percent:0;mso-height-percent:0;mso-width-relative:margin;mso-height-relative:margin;v-text-anchor:middle" arcsize="10923f" o:gfxdata="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" strokecolor="#1f4d78 [1604]" strokeweight="1pt">
+              <v:roundrect w14:anchorId="7CF460F7" id="Rounded Rectangle 14" o:spid="_x0000_s1026" style="position:absolute;margin-left:315.1pt;margin-top:237pt;width:282.6pt;height:178.3pt;z-index:251669504;visibility:visible;mso-wrap-style:square;mso-width-percent:0;mso-height-percent:0;mso-wrap-distance-left:9pt;mso-wrap-distance-top:0;mso-wrap-distance-right:9pt;mso-wrap-distance-bottom:0;mso-position-horizontal:absolute;mso-position-horizontal-relative:page;mso-position-vertical:absolute;mso-position-vertical-relative:text;mso-width-percent:0;mso-height-percent:0;mso-width-relative:margin;mso-height-relative:margin;v-text-anchor:middle" arcsize="10923f" o:gfxdata="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" strokecolor="#1f4d78 [1604]" strokeweight="1pt">
                 <v:fill r:id="rId9" o:title="" recolor="t" rotate="t" type="frame"/>
                 <v:stroke joinstyle="miter"/>
                 <w10:wrap anchorx="page"/>
@@ -270,18 +455,198 @@
         <mc:AlternateContent>
           <mc:Choice Requires="wps">
             <w:drawing>
-              <wp:anchor distT="0" distB="0" distL="114300" distR="114300" simplePos="0" relativeHeight="251666432" behindDoc="0" locked="0" layoutInCell="1" allowOverlap="1" wp14:anchorId="74036842" wp14:editId="41C39720">
+              <wp:anchor distT="45720" distB="45720" distL="114300" distR="114300" simplePos="0" relativeHeight="251683840" behindDoc="0" locked="0" layoutInCell="1" allowOverlap="1" wp14:anchorId="7E6FE4B4" wp14:editId="25A5CFEB">
+                <wp:simplePos x="0" y="0"/>
+                <wp:positionH relativeFrom="margin">
+                  <wp:posOffset>-427567</wp:posOffset>
+                </wp:positionH>
+                <wp:positionV relativeFrom="paragraph">
+                  <wp:posOffset>2078144</wp:posOffset>
+                </wp:positionV>
+                <wp:extent cx="2360930" cy="1404620"/>
+                <wp:effectExtent l="0" t="0" r="22860" b="13970"/>
+                <wp:wrapSquare wrapText="bothSides"/>
+                <wp:docPr id="3" name="Text Box 3"/>
+                <wp:cNvGraphicFramePr>
+                  <a:graphicFrameLocks xmlns:a="http://schemas.openxmlformats.org/drawingml/2006/main"/>
+                </wp:cNvGraphicFramePr>
+                <a:graphic xmlns:a="http://schemas.openxmlformats.org/drawingml/2006/main">
+                  <a:graphicData uri="http://schemas.microsoft.com/office/word/2010/wordprocessingShape">
+                    <wps:wsp>
+                      <wps:cNvSpPr txBox="1">
+                        <a:spLocks noChangeArrowheads="1"/>
+                      </wps:cNvSpPr>
+                      <wps:spPr bwMode="auto">
+                        <a:xfrm>
+                          <a:off x="0" y="0"/>
+                          <a:ext cx="2360930" cy="1404620"/>
+                        </a:xfrm>
+                        <a:prstGeom prst="rect">
+                          <a:avLst/>
+                        </a:prstGeom>
+                        <a:solidFill>
+                          <a:srgbClr val="FFFFFF"/>
+                        </a:solidFill>
+                        <a:ln w="9525">
+                          <a:solidFill>
+                            <a:srgbClr val="000000"/>
+                          </a:solidFill>
+                          <a:miter lim="800000"/>
+                          <a:headEnd/>
+                          <a:tailEnd/>
+                        </a:ln>
+                      </wps:spPr>
+                      <wps:txbx>
+                        <w:txbxContent>
+                          <w:p>
+                            <w:r>
+                              <w:t>Step:02</w:t>
+                            </w:r>
+                          </w:p>
+                        </w:txbxContent>
+                      </wps:txbx>
+                      <wps:bodyPr rot="0" vert="horz" wrap="square" lIns="91440" tIns="45720" rIns="91440" bIns="45720" anchor="t" anchorCtr="0">
+                        <a:spAutoFit/>
+                      </wps:bodyPr>
+                    </wps:wsp>
+                  </a:graphicData>
+                </a:graphic>
+                <wp14:sizeRelH relativeFrom="margin">
+                  <wp14:pctWidth>40000</wp14:pctWidth>
+                </wp14:sizeRelH>
+                <wp14:sizeRelV relativeFrom="margin">
+                  <wp14:pctHeight>20000</wp14:pctHeight>
+                </wp14:sizeRelV>
+              </wp:anchor>
+            </w:drawing>
+          </mc:Choice>
+          <mc:Fallback>
+            <w:pict>
+              <v:shape w14:anchorId="7E6FE4B4" id="Text Box 3" o:spid="_x0000_s1028" type="#_x0000_t202" style="position:absolute;margin-left:-33.65pt;margin-top:163.65pt;width:185.9pt;height:110.6pt;z-index:251683840;visibility:visible;mso-wrap-style:square;mso-width-percent:400;mso-height-percent:200;mso-wrap-distance-left:9pt;mso-wrap-distance-top:3.6pt;mso-wrap-distance-right:9pt;mso-wrap-distance-bottom:3.6pt;mso-position-horizontal:absolute;mso-position-horizontal-relative:margin;mso-position-vertical:absolute;mso-position-vertical-relative:text;mso-width-percent:400;mso-height-percent:200;mso-width-relative:margin;mso-height-relative:margin;v-text-anchor:top" o:gfxdata="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">
+                <v:textbox style="mso-fit-shape-to-text:t">
+                  <w:txbxContent>
+                    <w:p>
+                      <w:r>
+                        <w:t>Step:02</w:t>
+                      </w:r>
+                    </w:p>
+                  </w:txbxContent>
+                </v:textbox>
+                <w10:wrap type="square" anchorx="margin"/>
+              </v:shape>
+            </w:pict>
+          </mc:Fallback>
+        </mc:AlternateContent>
+      </w:r>
+      <w:r>
+        <w:rPr>
+          <w:noProof/>
+        </w:rPr>
+        <mc:AlternateContent>
+          <mc:Choice Requires="wps">
+            <w:drawing>
+              <wp:anchor distT="45720" distB="45720" distL="114300" distR="114300" simplePos="0" relativeHeight="251685888" behindDoc="0" locked="0" layoutInCell="1" allowOverlap="1" wp14:anchorId="65262E08" wp14:editId="04C0C393">
+                <wp:simplePos x="0" y="0"/>
+                <wp:positionH relativeFrom="margin">
+                  <wp:posOffset>3453977</wp:posOffset>
+                </wp:positionH>
+                <wp:positionV relativeFrom="paragraph">
+                  <wp:posOffset>1851025</wp:posOffset>
+                </wp:positionV>
+                <wp:extent cx="2565400" cy="1404620"/>
+                <wp:effectExtent l="0" t="0" r="25400" b="13970"/>
+                <wp:wrapSquare wrapText="bothSides"/>
+                <wp:docPr id="4" name="Text Box 4"/>
+                <wp:cNvGraphicFramePr>
+                  <a:graphicFrameLocks xmlns:a="http://schemas.openxmlformats.org/drawingml/2006/main"/>
+                </wp:cNvGraphicFramePr>
+                <a:graphic xmlns:a="http://schemas.openxmlformats.org/drawingml/2006/main">
+                  <a:graphicData uri="http://schemas.microsoft.com/office/word/2010/wordprocessingShape">
+                    <wps:wsp>
+                      <wps:cNvSpPr txBox="1">
+                        <a:spLocks noChangeArrowheads="1"/>
+                      </wps:cNvSpPr>
+                      <wps:spPr bwMode="auto">
+                        <a:xfrm>
+                          <a:off x="0" y="0"/>
+                          <a:ext cx="2565400" cy="1404620"/>
+                        </a:xfrm>
+                        <a:prstGeom prst="rect">
+                          <a:avLst/>
+                        </a:prstGeom>
+                        <a:solidFill>
+                          <a:srgbClr val="FFFFFF"/>
+                        </a:solidFill>
+                        <a:ln w="9525">
+                          <a:solidFill>
+                            <a:srgbClr val="000000"/>
+                          </a:solidFill>
+                          <a:miter lim="800000"/>
+                          <a:headEnd/>
+                          <a:tailEnd/>
+                        </a:ln>
+                      </wps:spPr>
+                      <wps:txbx>
+                        <w:txbxContent>
+                          <w:p>
+                            <w:r>
+                              <w:t>Step:03</w:t>
+                            </w:r>
+                          </w:p>
+                        </w:txbxContent>
+                      </wps:txbx>
+                      <wps:bodyPr rot="0" vert="horz" wrap="square" lIns="91440" tIns="45720" rIns="91440" bIns="45720" anchor="t" anchorCtr="0">
+                        <a:spAutoFit/>
+                      </wps:bodyPr>
+                    </wps:wsp>
+                  </a:graphicData>
+                </a:graphic>
+                <wp14:sizeRelH relativeFrom="margin">
+                  <wp14:pctWidth>0</wp14:pctWidth>
+                </wp14:sizeRelH>
+                <wp14:sizeRelV relativeFrom="margin">
+                  <wp14:pctHeight>20000</wp14:pctHeight>
+                </wp14:sizeRelV>
+              </wp:anchor>
+            </w:drawing>
+          </mc:Choice>
+          <mc:Fallback>
+            <w:pict>
+              <v:shape w14:anchorId="65262E08" id="Text Box 4" o:spid="_x0000_s1029" type="#_x0000_t202" style="position:absolute;margin-left:271.95pt;margin-top:145.75pt;width:202pt;height:110.6pt;z-index:251685888;visibility:visible;mso-wrap-style:square;mso-width-percent:0;mso-height-percent:200;mso-wrap-distance-left:9pt;mso-wrap-distance-top:3.6pt;mso-wrap-distance-right:9pt;mso-wrap-distance-bottom:3.6pt;mso-position-horizontal:absolute;mso-position-horizontal-relative:margin;mso-position-vertical:absolute;mso-position-vertical-relative:text;mso-width-percent:0;mso-height-percent:200;mso-width-relative:margin;mso-height-relative:margin;v-text-anchor:top" o:gfxdata="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">
+                <v:textbox style="mso-fit-shape-to-text:t">
+                  <w:txbxContent>
+                    <w:p>
+                      <w:r>
+                        <w:t>Step:03</w:t>
+                      </w:r>
+                    </w:p>
+                  </w:txbxContent>
+                </v:textbox>
+                <w10:wrap type="square" anchorx="margin"/>
+              </v:shape>
+            </w:pict>
+          </mc:Fallback>
+        </mc:AlternateContent>
+      </w:r>
+      <w:r>
+        <w:rPr>
+          <w:noProof/>
+        </w:rPr>
+        <mc:AlternateContent>
+          <mc:Choice Requires="wps">
+            <w:drawing>
+              <wp:anchor distT="0" distB="0" distL="114300" distR="114300" simplePos="0" relativeHeight="251668480" behindDoc="0" locked="0" layoutInCell="1" allowOverlap="1" wp14:anchorId="44275FD2" wp14:editId="3593E47E">
                 <wp:simplePos x="0" y="0"/>
                 <wp:positionH relativeFrom="column">
-                  <wp:posOffset>-723265</wp:posOffset>
+                  <wp:posOffset>-853440</wp:posOffset>
                 </wp:positionH>
                 <wp:positionV relativeFrom="paragraph">
-                  <wp:posOffset>1388110</wp:posOffset>
+                  <wp:posOffset>2877396</wp:posOffset>
                 </wp:positionV>
-                <wp:extent cx="3329940" cy="2203450"/>
-                <wp:effectExtent l="0" t="0" r="22860" b="25400"/>
+                <wp:extent cx="3421380" cy="2430780"/>
+                <wp:effectExtent l="0" t="0" r="26670" b="26670"/>
                 <wp:wrapNone/>
-                <wp:docPr id="12" name="Rounded Rectangle 12"/>
+                <wp:docPr id="13" name="Rounded Rectangle 13"/>
                 <wp:cNvGraphicFramePr/>
                 <a:graphic xmlns:a="http://schemas.openxmlformats.org/drawingml/2006/main">
                   <a:graphicData uri="http://schemas.microsoft.com/office/word/2010/wordprocessingShape">
@@ -290,7 +655,7 @@
                       <wps:spPr>
                         <a:xfrm>
                           <a:off x="0" y="0"/>
-                          <a:ext cx="3329940" cy="2203450"/>
+                          <a:ext cx="3421380" cy="2430780"/>
                         </a:xfrm>
                         <a:prstGeom prst="roundRect">
                           <a:avLst/>
@@ -330,12 +695,15 @@
                 <wp14:sizeRelH relativeFrom="margin">
                   <wp14:pctWidth>0</wp14:pctWidth>
                 </wp14:sizeRelH>
+                <wp14:sizeRelV relativeFrom="margin">
+                  <wp14:pctHeight>0</wp14:pctHeight>
+                </wp14:sizeRelV>
               </wp:anchor>
             </w:drawing>
           </mc:Choice>
           <mc:Fallback>
             <w:pict>
-              <v:roundrect w14:anchorId="4F52CE12" id="Rounded Rectangle 12" o:spid="_x0000_s1026" style="position:absolute;margin-left:-56.95pt;margin-top:109.3pt;width:262.2pt;height:173.5pt;z-index:251666432;visibility:visible;mso-wrap-style:square;mso-width-percent:0;mso-wrap-distance-left:9pt;mso-wrap-distance-top:0;mso-wrap-distance-right:9pt;mso-wrap-distance-bottom:0;mso-position-horizontal:absolute;mso-position-horizontal-relative:text;mso-position-vertical:absolute;mso-position-vertical-relative:text;mso-width-percent:0;mso-width-relative:margin;v-text-anchor:middle" arcsize="10923f" o:gfxdata="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" strokecolor="#1f4d78 [1604]" strokeweight="1pt">
+              <v:roundrect w14:anchorId="5B06CC4B" id="Rounded Rectangle 13" o:spid="_x0000_s1026" style="position:absolute;margin-left:-67.2pt;margin-top:226.55pt;width:269.4pt;height:191.4pt;z-index:251668480;visibility:visible;mso-wrap-style:square;mso-width-percent:0;mso-height-percent:0;mso-wrap-distance-left:9pt;mso-wrap-distance-top:0;mso-wrap-distance-right:9pt;mso-wrap-distance-bottom:0;mso-position-horizontal:absolute;mso-position-horizontal-relative:text;mso-position-vertical:absolute;mso-position-vertical-relative:text;mso-width-percent:0;mso-height-percent:0;mso-width-relative:margin;mso-height-relative:margin;v-text-anchor:middle" arcsize="10923f" o:gfxdata="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" strokecolor="#1f4d78 [1604]" strokeweight="1pt">
                 <v:fill r:id="rId11" o:title="" recolor="t" rotate="t" type="frame"/>
                 <v:stroke joinstyle="miter"/>
               </v:roundrect>
@@ -348,7 +716,6 @@
       </w:r>
     </w:p>
     <w:p>
-      <w:bookmarkStart w:id="0" w:name="_GoBack"/>
       <w:r>
         <w:rPr>
           <w:noProof/>
@@ -357,149 +724,85 @@
         <mc:AlternateContent>
           <mc:Choice Requires="wps">
             <w:drawing>
-              <wp:anchor distT="0" distB="0" distL="114300" distR="114300" simplePos="0" relativeHeight="251671552" behindDoc="0" locked="0" layoutInCell="1" allowOverlap="1" wp14:anchorId="6C3F62B2" wp14:editId="56BA3063">
+              <wp:anchor distT="45720" distB="45720" distL="114300" distR="114300" simplePos="0" relativeHeight="251687936" behindDoc="0" locked="0" layoutInCell="1" allowOverlap="1" wp14:anchorId="022F3F94" wp14:editId="69A6BAE0">
                 <wp:simplePos x="0" y="0"/>
-                <wp:positionH relativeFrom="column">
-                  <wp:posOffset>3246120</wp:posOffset>
+                <wp:positionH relativeFrom="margin">
+                  <wp:posOffset>-482600</wp:posOffset>
                 </wp:positionH>
                 <wp:positionV relativeFrom="paragraph">
-                  <wp:posOffset>5753100</wp:posOffset>
+                  <wp:posOffset>0</wp:posOffset>
                 </wp:positionV>
-                <wp:extent cx="3215640" cy="2362200"/>
-                <wp:effectExtent l="0" t="0" r="22860" b="19050"/>
-                <wp:wrapNone/>
-                <wp:docPr id="15" name="Rounded Rectangle 15"/>
-                <wp:cNvGraphicFramePr/>
+                <wp:extent cx="2360930" cy="1404620"/>
+                <wp:effectExtent l="0" t="0" r="22860" b="13970"/>
+                <wp:wrapSquare wrapText="bothSides"/>
+                <wp:docPr id="5" name="Text Box 5"/>
+                <wp:cNvGraphicFramePr>
+                  <a:graphicFrameLocks xmlns:a="http://schemas.openxmlformats.org/drawingml/2006/main"/>
+                </wp:cNvGraphicFramePr>
                 <a:graphic xmlns:a="http://schemas.openxmlformats.org/drawingml/2006/main">
                   <a:graphicData uri="http://schemas.microsoft.com/office/word/2010/wordprocessingShape">
                     <wps:wsp>
-                      <wps:cNvSpPr/>
-                      <wps:spPr>
+                      <wps:cNvSpPr txBox="1">
+                        <a:spLocks noChangeArrowheads="1"/>
+                      </wps:cNvSpPr>
+                      <wps:spPr bwMode="auto">
                         <a:xfrm>
                           <a:off x="0" y="0"/>
-                          <a:ext cx="3215640" cy="2362200"/>
+                          <a:ext cx="2360930" cy="1404620"/>
                         </a:xfrm>
-                        <a:prstGeom prst="roundRect">
+                        <a:prstGeom prst="rect">
                           <a:avLst/>
                         </a:prstGeom>
+                        <a:solidFill>
+                          <a:srgbClr val="FFFFFF"/>
+                        </a:solidFill>
+                        <a:ln w="9525">
+                          <a:solidFill>
+                            <a:srgbClr val="000000"/>
+                          </a:solidFill>
+                          <a:miter lim="800000"/>
+                          <a:headEnd/>
+                          <a:tailEnd/>
+                        </a:ln>
                       </wps:spPr>
-                      <wps:style>
-                        <a:lnRef idx="2">
-                          <a:schemeClr val="accent1">
-                            <a:shade val="50000"/>
-                          </a:schemeClr>
-                        </a:lnRef>
-                        <a:fillRef idx="1">
-                          <a:schemeClr val="accent1"/>
-                        </a:fillRef>
-                        <a:effectRef idx="0">
-                          <a:schemeClr val="accent1"/>
-                        </a:effectRef>
-                        <a:fontRef idx="minor">
-                          <a:schemeClr val="lt1"/>
-                        </a:fontRef>
-                      </wps:style>
-                      <wps:bodyPr rot="0" spcFirstLastPara="0" vertOverflow="overflow" horzOverflow="overflow" vert="horz" wrap="square" lIns="91440" tIns="45720" rIns="91440" bIns="45720" numCol="1" spcCol="0" rtlCol="0" fromWordArt="0" anchor="ctr" anchorCtr="0" forceAA="0" compatLnSpc="1">
-                        <a:prstTxWarp prst="textNoShape">
-                          <a:avLst/>
-                        </a:prstTxWarp>
-                        <a:noAutofit/>
+                      <wps:txbx>
+                        <w:txbxContent>
+                          <w:p>
+                            <w:r>
+                              <w:t>Step:04</w:t>
+                            </w:r>
+                          </w:p>
+                        </w:txbxContent>
+                      </wps:txbx>
+                      <wps:bodyPr rot="0" vert="horz" wrap="square" lIns="91440" tIns="45720" rIns="91440" bIns="45720" anchor="t" anchorCtr="0">
+                        <a:spAutoFit/>
                       </wps:bodyPr>
                     </wps:wsp>
                   </a:graphicData>
                 </a:graphic>
                 <wp14:sizeRelH relativeFrom="margin">
-                  <wp14:pctWidth>0</wp14:pctWidth>
+                  <wp14:pctWidth>40000</wp14:pctWidth>
                 </wp14:sizeRelH>
                 <wp14:sizeRelV relativeFrom="margin">
-                  <wp14:pctHeight>0</wp14:pctHeight>
+                  <wp14:pctHeight>20000</wp14:pctHeight>
                 </wp14:sizeRelV>
               </wp:anchor>
             </w:drawing>
           </mc:Choice>
           <mc:Fallback>
             <w:pict>
-              <v:roundrect w14:anchorId="0AB4815B" id="Rounded Rectangle 15" o:spid="_x0000_s1026" style="position:absolute;margin-left:255.6pt;margin-top:453pt;width:253.2pt;height:186pt;z-index:251671552;visibility:visible;mso-wrap-style:square;mso-width-percent:0;mso-height-percent:0;mso-wrap-distance-left:9pt;mso-wrap-distance-top:0;mso-wrap-distance-right:9pt;mso-wrap-distance-bottom:0;mso-position-horizontal:absolute;mso-position-horizontal-relative:text;mso-position-vertical:absolute;mso-position-vertical-relative:text;mso-width-percent:0;mso-height-percent:0;mso-width-relative:margin;mso-height-relative:margin;v-text-anchor:middle" arcsize="10923f" o:gfxdata="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" fillcolor="#5b9bd5 [3204]" strokecolor="#1f4d78 [1604]" strokeweight="1pt">
-                <v:stroke joinstyle="miter"/>
-              </v:roundrect>
-            </w:pict>
-          </mc:Fallback>
-        </mc:AlternateContent>
-      </w:r>
-      <w:bookmarkEnd w:id="0"/>
-      <w:r>
-        <w:rPr>
-          <w:noProof/>
-        </w:rPr>
-        <mc:AlternateContent>
-          <mc:Choice Requires="wps">
-            <w:drawing>
-              <wp:anchor distT="0" distB="0" distL="114300" distR="114300" simplePos="0" relativeHeight="251673600" behindDoc="0" locked="0" layoutInCell="1" allowOverlap="1" wp14:anchorId="233D6040" wp14:editId="04A23106">
-                <wp:simplePos x="0" y="0"/>
-                <wp:positionH relativeFrom="margin">
-                  <wp:posOffset>-708660</wp:posOffset>
-                </wp:positionH>
-                <wp:positionV relativeFrom="paragraph">
-                  <wp:posOffset>5753100</wp:posOffset>
-                </wp:positionV>
-                <wp:extent cx="3246120" cy="2339340"/>
-                <wp:effectExtent l="0" t="0" r="11430" b="22860"/>
-                <wp:wrapNone/>
-                <wp:docPr id="16" name="Rounded Rectangle 16"/>
-                <wp:cNvGraphicFramePr/>
-                <a:graphic xmlns:a="http://schemas.openxmlformats.org/drawingml/2006/main">
-                  <a:graphicData uri="http://schemas.microsoft.com/office/word/2010/wordprocessingShape">
-                    <wps:wsp>
-                      <wps:cNvSpPr/>
-                      <wps:spPr>
-                        <a:xfrm>
-                          <a:off x="0" y="0"/>
-                          <a:ext cx="3246120" cy="2339340"/>
-                        </a:xfrm>
-                        <a:prstGeom prst="roundRect">
-                          <a:avLst/>
-                        </a:prstGeom>
-                      </wps:spPr>
-                      <wps:style>
-                        <a:lnRef idx="2">
-                          <a:schemeClr val="accent1">
-                            <a:shade val="50000"/>
-                          </a:schemeClr>
-                        </a:lnRef>
-                        <a:fillRef idx="1">
-                          <a:schemeClr val="accent1"/>
-                        </a:fillRef>
-                        <a:effectRef idx="0">
-                          <a:schemeClr val="accent1"/>
-                        </a:effectRef>
-                        <a:fontRef idx="minor">
-                          <a:schemeClr val="lt1"/>
-                        </a:fontRef>
-                      </wps:style>
-                      <wps:bodyPr rot="0" spcFirstLastPara="0" vertOverflow="overflow" horzOverflow="overflow" vert="horz" wrap="square" lIns="91440" tIns="45720" rIns="91440" bIns="45720" numCol="1" spcCol="0" rtlCol="0" fromWordArt="0" anchor="ctr" anchorCtr="0" forceAA="0" compatLnSpc="1">
-                        <a:prstTxWarp prst="textNoShape">
-                          <a:avLst/>
-                        </a:prstTxWarp>
-                        <a:noAutofit/>
-                      </wps:bodyPr>
-                    </wps:wsp>
-                  </a:graphicData>
-                </a:graphic>
-                <wp14:sizeRelH relativeFrom="margin">
-                  <wp14:pctWidth>0</wp14:pctWidth>
-                </wp14:sizeRelH>
-                <wp14:sizeRelV relativeFrom="margin">
-                  <wp14:pctHeight>0</wp14:pctHeight>
-                </wp14:sizeRelV>
-              </wp:anchor>
-            </w:drawing>
-          </mc:Choice>
-          <mc:Fallback>
-            <w:pict>
-              <v:roundrect w14:anchorId="0E2D6970" id="Rounded Rectangle 16" o:spid="_x0000_s1026" style="position:absolute;margin-left:-55.8pt;margin-top:453pt;width:255.6pt;height:184.2pt;z-index:251673600;visibility:visible;mso-wrap-style:square;mso-width-percent:0;mso-height-percent:0;mso-wrap-distance-left:9pt;mso-wrap-distance-top:0;mso-wrap-distance-right:9pt;mso-wrap-distance-bottom:0;mso-position-horizontal:absolute;mso-position-horizontal-relative:margin;mso-position-vertical:absolute;mso-position-vertical-relative:text;mso-width-percent:0;mso-height-percent:0;mso-width-relative:margin;mso-height-relative:margin;v-text-anchor:middle" arcsize="10923f" o:gfxdata="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" fillcolor="#5b9bd5 [3204]" strokecolor="#1f4d78 [1604]" strokeweight="1pt">
-                <v:stroke joinstyle="miter"/>
-                <w10:wrap anchorx="margin"/>
-              </v:roundrect>
+              <v:shape w14:anchorId="022F3F94" id="Text Box 5" o:spid="_x0000_s1030" type="#_x0000_t202" style="position:absolute;margin-left:-38pt;margin-top:0;width:185.9pt;height:110.6pt;z-index:251687936;visibility:visible;mso-wrap-style:square;mso-width-percent:400;mso-height-percent:200;mso-wrap-distance-left:9pt;mso-wrap-distance-top:3.6pt;mso-wrap-distance-right:9pt;mso-wrap-distance-bottom:3.6pt;mso-position-horizontal:absolute;mso-position-horizontal-relative:margin;mso-position-vertical:absolute;mso-position-vertical-relative:text;mso-width-percent:400;mso-height-percent:200;mso-width-relative:margin;mso-height-relative:margin;v-text-anchor:top" o:gfxdata="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">
+                <v:textbox style="mso-fit-shape-to-text:t">
+                  <w:txbxContent>
+                    <w:p>
+                      <w:r>
+                        <w:t>Step:04</w:t>
+                      </w:r>
+                    </w:p>
+                  </w:txbxContent>
+                </v:textbox>
+                <w10:wrap type="square" anchorx="margin"/>
+              </v:shape>
             </w:pict>
           </mc:Fallback>
         </mc:AlternateContent>
@@ -511,13 +814,105 @@
         <mc:AlternateContent>
           <mc:Choice Requires="wps">
             <w:drawing>
-              <wp:anchor distT="0" distB="0" distL="114300" distR="114300" simplePos="0" relativeHeight="251661312" behindDoc="0" locked="0" layoutInCell="1" allowOverlap="1" wp14:anchorId="5D3F6861" wp14:editId="649429BA">
+              <wp:anchor distT="45720" distB="45720" distL="114300" distR="114300" simplePos="0" relativeHeight="251688960" behindDoc="0" locked="0" layoutInCell="1" allowOverlap="1" wp14:anchorId="74EC7187" wp14:editId="2DCC5057">
                 <wp:simplePos x="0" y="0"/>
                 <wp:positionH relativeFrom="margin">
-                  <wp:posOffset>3124200</wp:posOffset>
+                  <wp:posOffset>3367405</wp:posOffset>
                 </wp:positionH>
                 <wp:positionV relativeFrom="paragraph">
-                  <wp:posOffset>2453640</wp:posOffset>
+                  <wp:posOffset>0</wp:posOffset>
+                </wp:positionV>
+                <wp:extent cx="2360930" cy="1404620"/>
+                <wp:effectExtent l="0" t="0" r="22860" b="13970"/>
+                <wp:wrapSquare wrapText="bothSides"/>
+                <wp:docPr id="6" name="Text Box 6"/>
+                <wp:cNvGraphicFramePr>
+                  <a:graphicFrameLocks xmlns:a="http://schemas.openxmlformats.org/drawingml/2006/main"/>
+                </wp:cNvGraphicFramePr>
+                <a:graphic xmlns:a="http://schemas.openxmlformats.org/drawingml/2006/main">
+                  <a:graphicData uri="http://schemas.microsoft.com/office/word/2010/wordprocessingShape">
+                    <wps:wsp>
+                      <wps:cNvSpPr txBox="1">
+                        <a:spLocks noChangeArrowheads="1"/>
+                      </wps:cNvSpPr>
+                      <wps:spPr bwMode="auto">
+                        <a:xfrm>
+                          <a:off x="0" y="0"/>
+                          <a:ext cx="2360930" cy="1404620"/>
+                        </a:xfrm>
+                        <a:prstGeom prst="rect">
+                          <a:avLst/>
+                        </a:prstGeom>
+                        <a:solidFill>
+                          <a:srgbClr val="FFFFFF"/>
+                        </a:solidFill>
+                        <a:ln w="9525">
+                          <a:solidFill>
+                            <a:srgbClr val="000000"/>
+                          </a:solidFill>
+                          <a:miter lim="800000"/>
+                          <a:headEnd/>
+                          <a:tailEnd/>
+                        </a:ln>
+                      </wps:spPr>
+                      <wps:txbx>
+                        <w:txbxContent>
+                          <w:p>
+                            <w:r>
+                              <w:t>Step:05</w:t>
+                            </w:r>
+                          </w:p>
+                        </w:txbxContent>
+                      </wps:txbx>
+                      <wps:bodyPr rot="0" vert="horz" wrap="square" lIns="91440" tIns="45720" rIns="91440" bIns="45720" anchor="t" anchorCtr="0">
+                        <a:spAutoFit/>
+                      </wps:bodyPr>
+                    </wps:wsp>
+                  </a:graphicData>
+                </a:graphic>
+                <wp14:sizeRelH relativeFrom="margin">
+                  <wp14:pctWidth>40000</wp14:pctWidth>
+                </wp14:sizeRelH>
+                <wp14:sizeRelV relativeFrom="margin">
+                  <wp14:pctHeight>20000</wp14:pctHeight>
+                </wp14:sizeRelV>
+              </wp:anchor>
+            </w:drawing>
+          </mc:Choice>
+          <mc:Fallback>
+            <w:pict>
+              <v:shape w14:anchorId="74EC7187" id="Text Box 6" o:spid="_x0000_s1031" type="#_x0000_t202" style="position:absolute;margin-left:265.15pt;margin-top:0;width:185.9pt;height:110.6pt;z-index:251688960;visibility:visible;mso-wrap-style:square;mso-width-percent:400;mso-height-percent:200;mso-wrap-distance-left:9pt;mso-wrap-distance-top:3.6pt;mso-wrap-distance-right:9pt;mso-wrap-distance-bottom:3.6pt;mso-position-horizontal:absolute;mso-position-horizontal-relative:margin;mso-position-vertical:absolute;mso-position-vertical-relative:text;mso-width-percent:400;mso-height-percent:200;mso-width-relative:margin;mso-height-relative:margin;v-text-anchor:top" o:gfxdata="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">
+                <v:textbox style="mso-fit-shape-to-text:t">
+                  <w:txbxContent>
+                    <w:p>
+                      <w:r>
+                        <w:t>Step:05</w:t>
+                      </w:r>
+                    </w:p>
+                  </w:txbxContent>
+                </v:textbox>
+                <w10:wrap type="square" anchorx="margin"/>
+              </v:shape>
+            </w:pict>
+          </mc:Fallback>
+        </mc:AlternateContent>
+      </w:r>
+    </w:p>
+    <w:p>
+      <w:r>
+        <w:rPr>
+          <w:noProof/>
+        </w:rPr>
+        <mc:AlternateContent>
+          <mc:Choice Requires="wps">
+            <w:drawing>
+              <wp:anchor distT="0" distB="0" distL="114300" distR="114300" simplePos="0" relativeHeight="251661312" behindDoc="0" locked="0" layoutInCell="1" allowOverlap="1" wp14:anchorId="25802540" wp14:editId="4021D640">
+                <wp:simplePos x="0" y="0"/>
+                <wp:positionH relativeFrom="margin">
+                  <wp:align>right</wp:align>
+                </wp:positionH>
+                <wp:positionV relativeFrom="paragraph">
+                  <wp:posOffset>5469890</wp:posOffset>
                 </wp:positionV>
                 <wp:extent cx="3261360" cy="2415540"/>
                 <wp:effectExtent l="0" t="0" r="15240" b="22860"/>
@@ -579,7 +974,7 @@
           </mc:Choice>
           <mc:Fallback>
             <w:pict>
-              <v:roundrect w14:anchorId="19E8DA3F" id="Rounded Rectangle 9" o:spid="_x0000_s1026" style="position:absolute;margin-left:246pt;margin-top:193.2pt;width:256.8pt;height:190.2pt;z-index:251661312;visibility:visible;mso-wrap-style:square;mso-width-percent:0;mso-height-percent:0;mso-wrap-distance-left:9pt;mso-wrap-distance-top:0;mso-wrap-distance-right:9pt;mso-wrap-distance-bottom:0;mso-position-horizontal:absolute;mso-position-horizontal-relative:margin;mso-position-vertical:absolute;mso-position-vertical-relative:text;mso-width-percent:0;mso-height-percent:0;mso-width-relative:margin;mso-height-relative:margin;v-text-anchor:middle" arcsize="10923f" o:gfxdata="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" strokecolor="#1f4d78 [1604]" strokeweight="1pt">
+              <v:roundrect w14:anchorId="3D6BCA19" id="Rounded Rectangle 9" o:spid="_x0000_s1026" style="position:absolute;margin-left:205.6pt;margin-top:430.7pt;width:256.8pt;height:190.2pt;z-index:251661312;visibility:visible;mso-wrap-style:square;mso-width-percent:0;mso-height-percent:0;mso-wrap-distance-left:9pt;mso-wrap-distance-top:0;mso-wrap-distance-right:9pt;mso-wrap-distance-bottom:0;mso-position-horizontal:right;mso-position-horizontal-relative:margin;mso-position-vertical:absolute;mso-position-vertical-relative:text;mso-width-percent:0;mso-height-percent:0;mso-width-relative:margin;mso-height-relative:margin;v-text-anchor:middle" arcsize="10923f" o:gfxdata="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" strokecolor="#1f4d78 [1604]" strokeweight="1pt">
                 <v:fill r:id="rId13" o:title="" recolor="t" rotate="t" type="frame"/>
                 <v:stroke joinstyle="miter"/>
                 <w10:wrap anchorx="margin"/>
@@ -595,13 +990,13 @@
         <mc:AlternateContent>
           <mc:Choice Requires="wps">
             <w:drawing>
-              <wp:anchor distT="0" distB="0" distL="114300" distR="114300" simplePos="0" relativeHeight="251675648" behindDoc="0" locked="0" layoutInCell="1" allowOverlap="1" wp14:anchorId="2311B244" wp14:editId="78F0B18B">
+              <wp:anchor distT="0" distB="0" distL="114300" distR="114300" simplePos="0" relativeHeight="251675648" behindDoc="0" locked="0" layoutInCell="1" allowOverlap="1" wp14:anchorId="187AAA21" wp14:editId="34DD655E">
                 <wp:simplePos x="0" y="0"/>
                 <wp:positionH relativeFrom="page">
-                  <wp:posOffset>167640</wp:posOffset>
+                  <wp:posOffset>40640</wp:posOffset>
                 </wp:positionH>
                 <wp:positionV relativeFrom="paragraph">
-                  <wp:posOffset>2491740</wp:posOffset>
+                  <wp:posOffset>5558790</wp:posOffset>
                 </wp:positionV>
                 <wp:extent cx="3253740" cy="2346960"/>
                 <wp:effectExtent l="0" t="0" r="22860" b="15240"/>
@@ -663,7 +1058,7 @@
           </mc:Choice>
           <mc:Fallback>
             <w:pict>
-              <v:roundrect w14:anchorId="696A225C" id="Rounded Rectangle 17" o:spid="_x0000_s1026" style="position:absolute;margin-left:13.2pt;margin-top:196.2pt;width:256.2pt;height:184.8pt;z-index:251675648;visibility:visible;mso-wrap-style:square;mso-width-percent:0;mso-height-percent:0;mso-wrap-distance-left:9pt;mso-wrap-distance-top:0;mso-wrap-distance-right:9pt;mso-wrap-distance-bottom:0;mso-position-horizontal:absolute;mso-position-horizontal-relative:page;mso-position-vertical:absolute;mso-position-vertical-relative:text;mso-width-percent:0;mso-height-percent:0;mso-width-relative:margin;mso-height-relative:margin;v-text-anchor:middle" arcsize="10923f" o:gfxdata="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" strokecolor="#1f4d78 [1604]" strokeweight="1pt">
+              <v:roundrect w14:anchorId="36876D2D" id="Rounded Rectangle 17" o:spid="_x0000_s1026" style="position:absolute;margin-left:3.2pt;margin-top:437.7pt;width:256.2pt;height:184.8pt;z-index:251675648;visibility:visible;mso-wrap-style:square;mso-width-percent:0;mso-height-percent:0;mso-wrap-distance-left:9pt;mso-wrap-distance-top:0;mso-wrap-distance-right:9pt;mso-wrap-distance-bottom:0;mso-position-horizontal:absolute;mso-position-horizontal-relative:page;mso-position-vertical:absolute;mso-position-vertical-relative:text;mso-width-percent:0;mso-height-percent:0;mso-width-relative:margin;mso-height-relative:margin;v-text-anchor:middle" arcsize="10923f" o:gfxdata="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" strokecolor="#1f4d78 [1604]" strokeweight="1pt">
                 <v:fill r:id="rId15" o:title="" recolor="t" rotate="t" type="frame"/>
                 <v:stroke joinstyle="miter"/>
                 <w10:wrap anchorx="page"/>
@@ -679,18 +1074,198 @@
         <mc:AlternateContent>
           <mc:Choice Requires="wps">
             <w:drawing>
-              <wp:anchor distT="0" distB="0" distL="114300" distR="114300" simplePos="0" relativeHeight="251663360" behindDoc="0" locked="0" layoutInCell="1" allowOverlap="1" wp14:anchorId="44D80F57" wp14:editId="2FD16189">
+              <wp:anchor distT="45720" distB="45720" distL="114300" distR="114300" simplePos="0" relativeHeight="251692032" behindDoc="0" locked="0" layoutInCell="1" allowOverlap="1" wp14:anchorId="2C869586" wp14:editId="42230F5E">
                 <wp:simplePos x="0" y="0"/>
-                <wp:positionH relativeFrom="page">
-                  <wp:posOffset>4023360</wp:posOffset>
+                <wp:positionH relativeFrom="margin">
+                  <wp:posOffset>3342005</wp:posOffset>
                 </wp:positionH>
                 <wp:positionV relativeFrom="paragraph">
-                  <wp:posOffset>-594360</wp:posOffset>
+                  <wp:posOffset>4175760</wp:posOffset>
                 </wp:positionV>
-                <wp:extent cx="3451860" cy="2332990"/>
-                <wp:effectExtent l="0" t="0" r="15240" b="10160"/>
+                <wp:extent cx="2360930" cy="1404620"/>
+                <wp:effectExtent l="0" t="0" r="22860" b="13970"/>
+                <wp:wrapSquare wrapText="bothSides"/>
+                <wp:docPr id="18" name="Text Box 18"/>
+                <wp:cNvGraphicFramePr>
+                  <a:graphicFrameLocks xmlns:a="http://schemas.openxmlformats.org/drawingml/2006/main"/>
+                </wp:cNvGraphicFramePr>
+                <a:graphic xmlns:a="http://schemas.openxmlformats.org/drawingml/2006/main">
+                  <a:graphicData uri="http://schemas.microsoft.com/office/word/2010/wordprocessingShape">
+                    <wps:wsp>
+                      <wps:cNvSpPr txBox="1">
+                        <a:spLocks noChangeArrowheads="1"/>
+                      </wps:cNvSpPr>
+                      <wps:spPr bwMode="auto">
+                        <a:xfrm>
+                          <a:off x="0" y="0"/>
+                          <a:ext cx="2360930" cy="1404620"/>
+                        </a:xfrm>
+                        <a:prstGeom prst="rect">
+                          <a:avLst/>
+                        </a:prstGeom>
+                        <a:solidFill>
+                          <a:srgbClr val="FFFFFF"/>
+                        </a:solidFill>
+                        <a:ln w="9525">
+                          <a:solidFill>
+                            <a:srgbClr val="000000"/>
+                          </a:solidFill>
+                          <a:miter lim="800000"/>
+                          <a:headEnd/>
+                          <a:tailEnd/>
+                        </a:ln>
+                      </wps:spPr>
+                      <wps:txbx>
+                        <w:txbxContent>
+                          <w:p>
+                            <w:r>
+                              <w:t>Step:07</w:t>
+                            </w:r>
+                          </w:p>
+                        </w:txbxContent>
+                      </wps:txbx>
+                      <wps:bodyPr rot="0" vert="horz" wrap="square" lIns="91440" tIns="45720" rIns="91440" bIns="45720" anchor="t" anchorCtr="0">
+                        <a:spAutoFit/>
+                      </wps:bodyPr>
+                    </wps:wsp>
+                  </a:graphicData>
+                </a:graphic>
+                <wp14:sizeRelH relativeFrom="margin">
+                  <wp14:pctWidth>40000</wp14:pctWidth>
+                </wp14:sizeRelH>
+                <wp14:sizeRelV relativeFrom="margin">
+                  <wp14:pctHeight>20000</wp14:pctHeight>
+                </wp14:sizeRelV>
+              </wp:anchor>
+            </w:drawing>
+          </mc:Choice>
+          <mc:Fallback>
+            <w:pict>
+              <v:shape w14:anchorId="2C869586" id="Text Box 18" o:spid="_x0000_s1032" type="#_x0000_t202" style="position:absolute;margin-left:263.15pt;margin-top:328.8pt;width:185.9pt;height:110.6pt;z-index:251692032;visibility:visible;mso-wrap-style:square;mso-width-percent:400;mso-height-percent:200;mso-wrap-distance-left:9pt;mso-wrap-distance-top:3.6pt;mso-wrap-distance-right:9pt;mso-wrap-distance-bottom:3.6pt;mso-position-horizontal:absolute;mso-position-horizontal-relative:margin;mso-position-vertical:absolute;mso-position-vertical-relative:text;mso-width-percent:400;mso-height-percent:200;mso-width-relative:margin;mso-height-relative:margin;v-text-anchor:top" o:gfxdata="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">
+                <v:textbox style="mso-fit-shape-to-text:t">
+                  <w:txbxContent>
+                    <w:p>
+                      <w:r>
+                        <w:t>Step:07</w:t>
+                      </w:r>
+                    </w:p>
+                  </w:txbxContent>
+                </v:textbox>
+                <w10:wrap type="square" anchorx="margin"/>
+              </v:shape>
+            </w:pict>
+          </mc:Fallback>
+        </mc:AlternateContent>
+      </w:r>
+      <w:r>
+        <w:rPr>
+          <w:noProof/>
+        </w:rPr>
+        <mc:AlternateContent>
+          <mc:Choice Requires="wps">
+            <w:drawing>
+              <wp:anchor distT="45720" distB="45720" distL="114300" distR="114300" simplePos="0" relativeHeight="251691008" behindDoc="0" locked="0" layoutInCell="1" allowOverlap="1" wp14:anchorId="5611733F" wp14:editId="767F1984">
+                <wp:simplePos x="0" y="0"/>
+                <wp:positionH relativeFrom="margin">
+                  <wp:posOffset>-482600</wp:posOffset>
+                </wp:positionH>
+                <wp:positionV relativeFrom="paragraph">
+                  <wp:posOffset>4099560</wp:posOffset>
+                </wp:positionV>
+                <wp:extent cx="2360930" cy="1404620"/>
+                <wp:effectExtent l="0" t="0" r="22860" b="13970"/>
+                <wp:wrapSquare wrapText="bothSides"/>
+                <wp:docPr id="8" name="Text Box 8"/>
+                <wp:cNvGraphicFramePr>
+                  <a:graphicFrameLocks xmlns:a="http://schemas.openxmlformats.org/drawingml/2006/main"/>
+                </wp:cNvGraphicFramePr>
+                <a:graphic xmlns:a="http://schemas.openxmlformats.org/drawingml/2006/main">
+                  <a:graphicData uri="http://schemas.microsoft.com/office/word/2010/wordprocessingShape">
+                    <wps:wsp>
+                      <wps:cNvSpPr txBox="1">
+                        <a:spLocks noChangeArrowheads="1"/>
+                      </wps:cNvSpPr>
+                      <wps:spPr bwMode="auto">
+                        <a:xfrm>
+                          <a:off x="0" y="0"/>
+                          <a:ext cx="2360930" cy="1404620"/>
+                        </a:xfrm>
+                        <a:prstGeom prst="rect">
+                          <a:avLst/>
+                        </a:prstGeom>
+                        <a:solidFill>
+                          <a:srgbClr val="FFFFFF"/>
+                        </a:solidFill>
+                        <a:ln w="9525">
+                          <a:solidFill>
+                            <a:srgbClr val="000000"/>
+                          </a:solidFill>
+                          <a:miter lim="800000"/>
+                          <a:headEnd/>
+                          <a:tailEnd/>
+                        </a:ln>
+                      </wps:spPr>
+                      <wps:txbx>
+                        <w:txbxContent>
+                          <w:p>
+                            <w:r>
+                              <w:t>Step:06</w:t>
+                            </w:r>
+                          </w:p>
+                        </w:txbxContent>
+                      </wps:txbx>
+                      <wps:bodyPr rot="0" vert="horz" wrap="square" lIns="91440" tIns="45720" rIns="91440" bIns="45720" anchor="t" anchorCtr="0">
+                        <a:spAutoFit/>
+                      </wps:bodyPr>
+                    </wps:wsp>
+                  </a:graphicData>
+                </a:graphic>
+                <wp14:sizeRelH relativeFrom="margin">
+                  <wp14:pctWidth>40000</wp14:pctWidth>
+                </wp14:sizeRelH>
+                <wp14:sizeRelV relativeFrom="margin">
+                  <wp14:pctHeight>20000</wp14:pctHeight>
+                </wp14:sizeRelV>
+              </wp:anchor>
+            </w:drawing>
+          </mc:Choice>
+          <mc:Fallback>
+            <w:pict>
+              <v:shape w14:anchorId="5611733F" id="Text Box 8" o:spid="_x0000_s1033" type="#_x0000_t202" style="position:absolute;margin-left:-38pt;margin-top:322.8pt;width:185.9pt;height:110.6pt;z-index:251691008;visibility:visible;mso-wrap-style:square;mso-width-percent:400;mso-height-percent:200;mso-wrap-distance-left:9pt;mso-wrap-distance-top:3.6pt;mso-wrap-distance-right:9pt;mso-wrap-distance-bottom:3.6pt;mso-position-horizontal:absolute;mso-position-horizontal-relative:margin;mso-position-vertical:absolute;mso-position-vertical-relative:text;mso-width-percent:400;mso-height-percent:200;mso-width-relative:margin;mso-height-relative:margin;v-text-anchor:top" o:gfxdata="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">
+                <v:textbox style="mso-fit-shape-to-text:t">
+                  <w:txbxContent>
+                    <w:p>
+                      <w:r>
+                        <w:t>Step:06</w:t>
+                      </w:r>
+                    </w:p>
+                  </w:txbxContent>
+                </v:textbox>
+                <w10:wrap type="square" anchorx="margin"/>
+              </v:shape>
+            </w:pict>
+          </mc:Fallback>
+        </mc:AlternateContent>
+      </w:r>
+      <w:r>
+        <w:rPr>
+          <w:noProof/>
+        </w:rPr>
+        <mc:AlternateContent>
+          <mc:Choice Requires="wps">
+            <w:drawing>
+              <wp:anchor distT="0" distB="0" distL="114300" distR="114300" simplePos="0" relativeHeight="251665408" behindDoc="0" locked="0" layoutInCell="1" allowOverlap="1" wp14:anchorId="0502D0CC" wp14:editId="5810CEB1">
+                <wp:simplePos x="0" y="0"/>
+                <wp:positionH relativeFrom="margin">
+                  <wp:posOffset>-828675</wp:posOffset>
+                </wp:positionH>
+                <wp:positionV relativeFrom="paragraph">
+                  <wp:posOffset>390525</wp:posOffset>
+                </wp:positionV>
+                <wp:extent cx="3307080" cy="2331720"/>
+                <wp:effectExtent l="0" t="0" r="26670" b="11430"/>
                 <wp:wrapNone/>
-                <wp:docPr id="10" name="Rounded Rectangle 10"/>
+                <wp:docPr id="11" name="Rounded Rectangle 11"/>
                 <wp:cNvGraphicFramePr/>
                 <a:graphic xmlns:a="http://schemas.openxmlformats.org/drawingml/2006/main">
                   <a:graphicData uri="http://schemas.microsoft.com/office/word/2010/wordprocessingShape">
@@ -699,7 +1274,7 @@
                       <wps:spPr>
                         <a:xfrm>
                           <a:off x="0" y="0"/>
-                          <a:ext cx="3451860" cy="2332990"/>
+                          <a:ext cx="3307080" cy="2331720"/>
                         </a:xfrm>
                         <a:prstGeom prst="roundRect">
                           <a:avLst/>
@@ -747,10 +1322,10 @@
           </mc:Choice>
           <mc:Fallback>
             <w:pict>
-              <v:roundrect w14:anchorId="41779072" id="Rounded Rectangle 10" o:spid="_x0000_s1026" style="position:absolute;margin-left:316.8pt;margin-top:-46.8pt;width:271.8pt;height:183.7pt;z-index:251663360;visibility:visible;mso-wrap-style:square;mso-width-percent:0;mso-height-percent:0;mso-wrap-distance-left:9pt;mso-wrap-distance-top:0;mso-wrap-distance-right:9pt;mso-wrap-distance-bottom:0;mso-position-horizontal:absolute;mso-position-horizontal-relative:page;mso-position-vertical:absolute;mso-position-vertical-relative:text;mso-width-percent:0;mso-height-percent:0;mso-width-relative:margin;mso-height-relative:margin;v-text-anchor:middle" arcsize="10923f" o:gfxdata="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" strokecolor="#1f4d78 [1604]" strokeweight="1pt">
+              <v:roundrect w14:anchorId="016B398D" id="Rounded Rectangle 11" o:spid="_x0000_s1026" style="position:absolute;margin-left:-65.25pt;margin-top:30.75pt;width:260.4pt;height:183.6pt;z-index:251665408;visibility:visible;mso-wrap-style:square;mso-width-percent:0;mso-height-percent:0;mso-wrap-distance-left:9pt;mso-wrap-distance-top:0;mso-wrap-distance-right:9pt;mso-wrap-distance-bottom:0;mso-position-horizontal:absolute;mso-position-horizontal-relative:margin;mso-position-vertical:absolute;mso-position-vertical-relative:text;mso-width-percent:0;mso-height-percent:0;mso-width-relative:margin;mso-height-relative:margin;v-text-anchor:middle" arcsize="10923f" o:gfxdata="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" strokecolor="#1f4d78 [1604]" strokeweight="1pt">
                 <v:fill r:id="rId17" o:title="" recolor="t" rotate="t" type="frame"/>
                 <v:stroke joinstyle="miter"/>
-                <w10:wrap anchorx="page"/>
+                <w10:wrap anchorx="margin"/>
               </v:roundrect>
             </w:pict>
           </mc:Fallback>
@@ -763,18 +1338,18 @@
         <mc:AlternateContent>
           <mc:Choice Requires="wps">
             <w:drawing>
-              <wp:anchor distT="0" distB="0" distL="114300" distR="114300" simplePos="0" relativeHeight="251665408" behindDoc="0" locked="0" layoutInCell="1" allowOverlap="1" wp14:anchorId="42381C1B" wp14:editId="7D9B09DA">
+              <wp:anchor distT="0" distB="0" distL="114300" distR="114300" simplePos="0" relativeHeight="251663360" behindDoc="0" locked="0" layoutInCell="1" allowOverlap="1" wp14:anchorId="17D63911" wp14:editId="1057EFB6">
                 <wp:simplePos x="0" y="0"/>
-                <wp:positionH relativeFrom="margin">
-                  <wp:posOffset>-762000</wp:posOffset>
+                <wp:positionH relativeFrom="page">
+                  <wp:posOffset>3844925</wp:posOffset>
                 </wp:positionH>
                 <wp:positionV relativeFrom="paragraph">
-                  <wp:posOffset>-601980</wp:posOffset>
+                  <wp:posOffset>338455</wp:posOffset>
                 </wp:positionV>
-                <wp:extent cx="3307080" cy="2331720"/>
-                <wp:effectExtent l="0" t="0" r="26670" b="11430"/>
+                <wp:extent cx="3451860" cy="2332990"/>
+                <wp:effectExtent l="0" t="0" r="15240" b="10160"/>
                 <wp:wrapNone/>
-                <wp:docPr id="11" name="Rounded Rectangle 11"/>
+                <wp:docPr id="10" name="Rounded Rectangle 10"/>
                 <wp:cNvGraphicFramePr/>
                 <a:graphic xmlns:a="http://schemas.openxmlformats.org/drawingml/2006/main">
                   <a:graphicData uri="http://schemas.microsoft.com/office/word/2010/wordprocessingShape">
@@ -783,7 +1358,7 @@
                       <wps:spPr>
                         <a:xfrm>
                           <a:off x="0" y="0"/>
-                          <a:ext cx="3307080" cy="2331720"/>
+                          <a:ext cx="3451860" cy="2332990"/>
                         </a:xfrm>
                         <a:prstGeom prst="roundRect">
                           <a:avLst/>
@@ -831,11 +1406,555 @@
           </mc:Choice>
           <mc:Fallback>
             <w:pict>
-              <v:roundrect w14:anchorId="1D436B86" id="Rounded Rectangle 11" o:spid="_x0000_s1026" style="position:absolute;margin-left:-60pt;margin-top:-47.4pt;width:260.4pt;height:183.6pt;z-index:251665408;visibility:visible;mso-wrap-style:square;mso-width-percent:0;mso-height-percent:0;mso-wrap-distance-left:9pt;mso-wrap-distance-top:0;mso-wrap-distance-right:9pt;mso-wrap-distance-bottom:0;mso-position-horizontal:absolute;mso-position-horizontal-relative:margin;mso-position-vertical:absolute;mso-position-vertical-relative:text;mso-width-percent:0;mso-height-percent:0;mso-width-relative:margin;mso-height-relative:margin;v-text-anchor:middle" arcsize="10923f" o:gfxdata="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" strokecolor="#1f4d78 [1604]" strokeweight="1pt">
+              <v:roundrect w14:anchorId="628B4CA0" id="Rounded Rectangle 10" o:spid="_x0000_s1026" style="position:absolute;margin-left:302.75pt;margin-top:26.65pt;width:271.8pt;height:183.7pt;z-index:251663360;visibility:visible;mso-wrap-style:square;mso-width-percent:0;mso-height-percent:0;mso-wrap-distance-left:9pt;mso-wrap-distance-top:0;mso-wrap-distance-right:9pt;mso-wrap-distance-bottom:0;mso-position-horizontal:absolute;mso-position-horizontal-relative:page;mso-position-vertical:absolute;mso-position-vertical-relative:text;mso-width-percent:0;mso-height-percent:0;mso-width-relative:margin;mso-height-relative:margin;v-text-anchor:middle" arcsize="10923f" o:gfxdata="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" strokecolor="#1f4d78 [1604]" strokeweight="1pt">
                 <v:fill r:id="rId19" o:title="" recolor="t" rotate="t" type="frame"/>
+                <v:stroke joinstyle="miter"/>
+                <w10:wrap anchorx="page"/>
+              </v:roundrect>
+            </w:pict>
+          </mc:Fallback>
+        </mc:AlternateContent>
+      </w:r>
+      <w:r>
+        <w:br w:type="page"/>
+      </w:r>
+    </w:p>
+    <w:p>
+      <w:r>
+        <w:rPr>
+          <w:noProof/>
+        </w:rPr>
+        <w:lastRenderedPageBreak/>
+        <mc:AlternateContent>
+          <mc:Choice Requires="wps">
+            <w:drawing>
+              <wp:anchor distT="0" distB="0" distL="114300" distR="114300" simplePos="0" relativeHeight="251671552" behindDoc="0" locked="0" layoutInCell="1" allowOverlap="1" wp14:anchorId="279B9651" wp14:editId="16E26697">
+                <wp:simplePos x="0" y="0"/>
+                <wp:positionH relativeFrom="margin">
+                  <wp:posOffset>2939143</wp:posOffset>
+                </wp:positionH>
+                <wp:positionV relativeFrom="paragraph">
+                  <wp:posOffset>5834743</wp:posOffset>
+                </wp:positionV>
+                <wp:extent cx="3679371" cy="2362200"/>
+                <wp:effectExtent l="0" t="0" r="16510" b="19050"/>
+                <wp:wrapNone/>
+                <wp:docPr id="15" name="Rounded Rectangle 15"/>
+                <wp:cNvGraphicFramePr/>
+                <a:graphic xmlns:a="http://schemas.openxmlformats.org/drawingml/2006/main">
+                  <a:graphicData uri="http://schemas.microsoft.com/office/word/2010/wordprocessingShape">
+                    <wps:wsp>
+                      <wps:cNvSpPr/>
+                      <wps:spPr>
+                        <a:xfrm>
+                          <a:off x="0" y="0"/>
+                          <a:ext cx="3679371" cy="2362200"/>
+                        </a:xfrm>
+                        <a:prstGeom prst="roundRect">
+                          <a:avLst/>
+                        </a:prstGeom>
+                        <a:blipFill>
+                          <a:blip r:embed="rId20"/>
+                          <a:stretch>
+                            <a:fillRect/>
+                          </a:stretch>
+                        </a:blipFill>
+                      </wps:spPr>
+                      <wps:style>
+                        <a:lnRef idx="2">
+                          <a:schemeClr val="accent1">
+                            <a:shade val="50000"/>
+                          </a:schemeClr>
+                        </a:lnRef>
+                        <a:fillRef idx="1">
+                          <a:schemeClr val="accent1"/>
+                        </a:fillRef>
+                        <a:effectRef idx="0">
+                          <a:schemeClr val="accent1"/>
+                        </a:effectRef>
+                        <a:fontRef idx="minor">
+                          <a:schemeClr val="lt1"/>
+                        </a:fontRef>
+                      </wps:style>
+                      <wps:bodyPr rot="0" spcFirstLastPara="0" vertOverflow="overflow" horzOverflow="overflow" vert="horz" wrap="square" lIns="91440" tIns="45720" rIns="91440" bIns="45720" numCol="1" spcCol="0" rtlCol="0" fromWordArt="0" anchor="ctr" anchorCtr="0" forceAA="0" compatLnSpc="1">
+                        <a:prstTxWarp prst="textNoShape">
+                          <a:avLst/>
+                        </a:prstTxWarp>
+                        <a:noAutofit/>
+                      </wps:bodyPr>
+                    </wps:wsp>
+                  </a:graphicData>
+                </a:graphic>
+                <wp14:sizeRelH relativeFrom="margin">
+                  <wp14:pctWidth>0</wp14:pctWidth>
+                </wp14:sizeRelH>
+                <wp14:sizeRelV relativeFrom="margin">
+                  <wp14:pctHeight>0</wp14:pctHeight>
+                </wp14:sizeRelV>
+              </wp:anchor>
+            </w:drawing>
+          </mc:Choice>
+          <mc:Fallback>
+            <w:pict>
+              <v:roundrect w14:anchorId="027F3714" id="Rounded Rectangle 15" o:spid="_x0000_s1026" style="position:absolute;margin-left:231.45pt;margin-top:459.45pt;width:289.7pt;height:186pt;z-index:251671552;visibility:visible;mso-wrap-style:square;mso-width-percent:0;mso-height-percent:0;mso-wrap-distance-left:9pt;mso-wrap-distance-top:0;mso-wrap-distance-right:9pt;mso-wrap-distance-bottom:0;mso-position-horizontal:absolute;mso-position-horizontal-relative:margin;mso-position-vertical:absolute;mso-position-vertical-relative:text;mso-width-percent:0;mso-height-percent:0;mso-width-relative:margin;mso-height-relative:margin;v-text-anchor:middle" arcsize="10923f" o:gfxdata="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" strokecolor="#1f4d78 [1604]" strokeweight="1pt">
+                <v:fill r:id="rId21" o:title="" recolor="t" rotate="t" type="frame"/>
                 <v:stroke joinstyle="miter"/>
                 <w10:wrap anchorx="margin"/>
               </v:roundrect>
+            </w:pict>
+          </mc:Fallback>
+        </mc:AlternateContent>
+      </w:r>
+      <w:r>
+        <w:rPr>
+          <w:noProof/>
+        </w:rPr>
+        <mc:AlternateContent>
+          <mc:Choice Requires="wps">
+            <w:drawing>
+              <wp:anchor distT="0" distB="0" distL="114300" distR="114300" simplePos="0" relativeHeight="251677696" behindDoc="0" locked="0" layoutInCell="1" allowOverlap="1" wp14:anchorId="0D0E90DD" wp14:editId="02D82776">
+                <wp:simplePos x="0" y="0"/>
+                <wp:positionH relativeFrom="page">
+                  <wp:posOffset>239486</wp:posOffset>
+                </wp:positionH>
+                <wp:positionV relativeFrom="paragraph">
+                  <wp:posOffset>5854337</wp:posOffset>
+                </wp:positionV>
+                <wp:extent cx="3215640" cy="2362200"/>
+                <wp:effectExtent l="0" t="0" r="22860" b="19050"/>
+                <wp:wrapNone/>
+                <wp:docPr id="1" name="Rounded Rectangle 1"/>
+                <wp:cNvGraphicFramePr/>
+                <a:graphic xmlns:a="http://schemas.openxmlformats.org/drawingml/2006/main">
+                  <a:graphicData uri="http://schemas.microsoft.com/office/word/2010/wordprocessingShape">
+                    <wps:wsp>
+                      <wps:cNvSpPr/>
+                      <wps:spPr>
+                        <a:xfrm>
+                          <a:off x="0" y="0"/>
+                          <a:ext cx="3215640" cy="2362200"/>
+                        </a:xfrm>
+                        <a:prstGeom prst="roundRect">
+                          <a:avLst/>
+                        </a:prstGeom>
+                        <a:blipFill>
+                          <a:blip r:embed="rId22"/>
+                          <a:stretch>
+                            <a:fillRect/>
+                          </a:stretch>
+                        </a:blipFill>
+                      </wps:spPr>
+                      <wps:style>
+                        <a:lnRef idx="2">
+                          <a:schemeClr val="accent1">
+                            <a:shade val="50000"/>
+                          </a:schemeClr>
+                        </a:lnRef>
+                        <a:fillRef idx="1">
+                          <a:schemeClr val="accent1"/>
+                        </a:fillRef>
+                        <a:effectRef idx="0">
+                          <a:schemeClr val="accent1"/>
+                        </a:effectRef>
+                        <a:fontRef idx="minor">
+                          <a:schemeClr val="lt1"/>
+                        </a:fontRef>
+                      </wps:style>
+                      <wps:bodyPr rot="0" spcFirstLastPara="0" vertOverflow="overflow" horzOverflow="overflow" vert="horz" wrap="square" lIns="91440" tIns="45720" rIns="91440" bIns="45720" numCol="1" spcCol="0" rtlCol="0" fromWordArt="0" anchor="ctr" anchorCtr="0" forceAA="0" compatLnSpc="1">
+                        <a:prstTxWarp prst="textNoShape">
+                          <a:avLst/>
+                        </a:prstTxWarp>
+                        <a:noAutofit/>
+                      </wps:bodyPr>
+                    </wps:wsp>
+                  </a:graphicData>
+                </a:graphic>
+                <wp14:sizeRelH relativeFrom="margin">
+                  <wp14:pctWidth>0</wp14:pctWidth>
+                </wp14:sizeRelH>
+                <wp14:sizeRelV relativeFrom="margin">
+                  <wp14:pctHeight>0</wp14:pctHeight>
+                </wp14:sizeRelV>
+              </wp:anchor>
+            </w:drawing>
+          </mc:Choice>
+          <mc:Fallback>
+            <w:pict>
+              <v:roundrect w14:anchorId="3788EFD8" id="Rounded Rectangle 1" o:spid="_x0000_s1026" style="position:absolute;margin-left:18.85pt;margin-top:460.95pt;width:253.2pt;height:186pt;z-index:251677696;visibility:visible;mso-wrap-style:square;mso-width-percent:0;mso-height-percent:0;mso-wrap-distance-left:9pt;mso-wrap-distance-top:0;mso-wrap-distance-right:9pt;mso-wrap-distance-bottom:0;mso-position-horizontal:absolute;mso-position-horizontal-relative:page;mso-position-vertical:absolute;mso-position-vertical-relative:text;mso-width-percent:0;mso-height-percent:0;mso-width-relative:margin;mso-height-relative:margin;v-text-anchor:middle" arcsize="10923f" o:gfxdata="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" strokecolor="#1f4d78 [1604]" strokeweight="1pt">
+                <v:fill r:id="rId23" o:title="" recolor="t" rotate="t" type="frame"/>
+                <v:stroke joinstyle="miter"/>
+                <w10:wrap anchorx="page"/>
+              </v:roundrect>
+            </w:pict>
+          </mc:Fallback>
+        </mc:AlternateContent>
+      </w:r>
+      <w:r>
+        <w:rPr>
+          <w:noProof/>
+        </w:rPr>
+        <mc:AlternateContent>
+          <mc:Choice Requires="wps">
+            <w:drawing>
+              <wp:anchor distT="45720" distB="45720" distL="114300" distR="114300" simplePos="0" relativeHeight="251697152" behindDoc="0" locked="0" layoutInCell="1" allowOverlap="1" wp14:anchorId="396E7DAF" wp14:editId="5ED875AC">
+                <wp:simplePos x="0" y="0"/>
+                <wp:positionH relativeFrom="margin">
+                  <wp:posOffset>-703307</wp:posOffset>
+                </wp:positionH>
+                <wp:positionV relativeFrom="paragraph">
+                  <wp:posOffset>4762047</wp:posOffset>
+                </wp:positionV>
+                <wp:extent cx="2360930" cy="1404620"/>
+                <wp:effectExtent l="0" t="0" r="22860" b="13970"/>
+                <wp:wrapSquare wrapText="bothSides"/>
+                <wp:docPr id="21" name="Text Box 21"/>
+                <wp:cNvGraphicFramePr>
+                  <a:graphicFrameLocks xmlns:a="http://schemas.openxmlformats.org/drawingml/2006/main"/>
+                </wp:cNvGraphicFramePr>
+                <a:graphic xmlns:a="http://schemas.openxmlformats.org/drawingml/2006/main">
+                  <a:graphicData uri="http://schemas.microsoft.com/office/word/2010/wordprocessingShape">
+                    <wps:wsp>
+                      <wps:cNvSpPr txBox="1">
+                        <a:spLocks noChangeArrowheads="1"/>
+                      </wps:cNvSpPr>
+                      <wps:spPr bwMode="auto">
+                        <a:xfrm>
+                          <a:off x="0" y="0"/>
+                          <a:ext cx="2360930" cy="1404620"/>
+                        </a:xfrm>
+                        <a:prstGeom prst="rect">
+                          <a:avLst/>
+                        </a:prstGeom>
+                        <a:solidFill>
+                          <a:srgbClr val="FFFFFF"/>
+                        </a:solidFill>
+                        <a:ln w="9525">
+                          <a:solidFill>
+                            <a:srgbClr val="000000"/>
+                          </a:solidFill>
+                          <a:miter lim="800000"/>
+                          <a:headEnd/>
+                          <a:tailEnd/>
+                        </a:ln>
+                      </wps:spPr>
+                      <wps:txbx>
+                        <w:txbxContent>
+                          <w:p>
+                            <w:r>
+                              <w:t>Step:09</w:t>
+                            </w:r>
+                          </w:p>
+                        </w:txbxContent>
+                      </wps:txbx>
+                      <wps:bodyPr rot="0" vert="horz" wrap="square" lIns="91440" tIns="45720" rIns="91440" bIns="45720" anchor="t" anchorCtr="0">
+                        <a:spAutoFit/>
+                      </wps:bodyPr>
+                    </wps:wsp>
+                  </a:graphicData>
+                </a:graphic>
+                <wp14:sizeRelH relativeFrom="margin">
+                  <wp14:pctWidth>40000</wp14:pctWidth>
+                </wp14:sizeRelH>
+                <wp14:sizeRelV relativeFrom="margin">
+                  <wp14:pctHeight>20000</wp14:pctHeight>
+                </wp14:sizeRelV>
+              </wp:anchor>
+            </w:drawing>
+          </mc:Choice>
+          <mc:Fallback>
+            <w:pict>
+              <v:shape w14:anchorId="396E7DAF" id="Text Box 21" o:spid="_x0000_s1034" type="#_x0000_t202" style="position:absolute;margin-left:-55.4pt;margin-top:374.95pt;width:185.9pt;height:110.6pt;z-index:251697152;visibility:visible;mso-wrap-style:square;mso-width-percent:400;mso-height-percent:200;mso-wrap-distance-left:9pt;mso-wrap-distance-top:3.6pt;mso-wrap-distance-right:9pt;mso-wrap-distance-bottom:3.6pt;mso-position-horizontal:absolute;mso-position-horizontal-relative:margin;mso-position-vertical:absolute;mso-position-vertical-relative:text;mso-width-percent:400;mso-height-percent:200;mso-width-relative:margin;mso-height-relative:margin;v-text-anchor:top" o:gfxdata="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">
+                <v:textbox style="mso-fit-shape-to-text:t">
+                  <w:txbxContent>
+                    <w:p>
+                      <w:r>
+                        <w:t>Step:09</w:t>
+                      </w:r>
+                    </w:p>
+                  </w:txbxContent>
+                </v:textbox>
+                <w10:wrap type="square" anchorx="margin"/>
+              </v:shape>
+            </w:pict>
+          </mc:Fallback>
+        </mc:AlternateContent>
+      </w:r>
+      <w:r>
+        <w:rPr>
+          <w:noProof/>
+        </w:rPr>
+        <mc:AlternateContent>
+          <mc:Choice Requires="wps">
+            <w:drawing>
+              <wp:anchor distT="45720" distB="45720" distL="114300" distR="114300" simplePos="0" relativeHeight="251694080" behindDoc="0" locked="0" layoutInCell="1" allowOverlap="1" wp14:anchorId="312722D3" wp14:editId="456FBC3D">
+                <wp:simplePos x="0" y="0"/>
+                <wp:positionH relativeFrom="margin">
+                  <wp:posOffset>1376680</wp:posOffset>
+                </wp:positionH>
+                <wp:positionV relativeFrom="paragraph">
+                  <wp:posOffset>344805</wp:posOffset>
+                </wp:positionV>
+                <wp:extent cx="2360930" cy="1404620"/>
+                <wp:effectExtent l="0" t="0" r="22860" b="13970"/>
+                <wp:wrapSquare wrapText="bothSides"/>
+                <wp:docPr id="19" name="Text Box 19"/>
+                <wp:cNvGraphicFramePr>
+                  <a:graphicFrameLocks xmlns:a="http://schemas.openxmlformats.org/drawingml/2006/main"/>
+                </wp:cNvGraphicFramePr>
+                <a:graphic xmlns:a="http://schemas.openxmlformats.org/drawingml/2006/main">
+                  <a:graphicData uri="http://schemas.microsoft.com/office/word/2010/wordprocessingShape">
+                    <wps:wsp>
+                      <wps:cNvSpPr txBox="1">
+                        <a:spLocks noChangeArrowheads="1"/>
+                      </wps:cNvSpPr>
+                      <wps:spPr bwMode="auto">
+                        <a:xfrm>
+                          <a:off x="0" y="0"/>
+                          <a:ext cx="2360930" cy="1404620"/>
+                        </a:xfrm>
+                        <a:prstGeom prst="rect">
+                          <a:avLst/>
+                        </a:prstGeom>
+                        <a:solidFill>
+                          <a:srgbClr val="FFFFFF"/>
+                        </a:solidFill>
+                        <a:ln w="9525">
+                          <a:solidFill>
+                            <a:srgbClr val="000000"/>
+                          </a:solidFill>
+                          <a:miter lim="800000"/>
+                          <a:headEnd/>
+                          <a:tailEnd/>
+                        </a:ln>
+                      </wps:spPr>
+                      <wps:txbx>
+                        <w:txbxContent>
+                          <w:p>
+                            <w:r>
+                              <w:t>Step:0</w:t>
+                            </w:r>
+                            <w:r>
+                              <w:t>8</w:t>
+                            </w:r>
+                            <w:bookmarkStart w:id="0" w:name="_GoBack"/>
+                            <w:bookmarkEnd w:id="0"/>
+                          </w:p>
+                        </w:txbxContent>
+                      </wps:txbx>
+                      <wps:bodyPr rot="0" vert="horz" wrap="square" lIns="91440" tIns="45720" rIns="91440" bIns="45720" anchor="t" anchorCtr="0">
+                        <a:spAutoFit/>
+                      </wps:bodyPr>
+                    </wps:wsp>
+                  </a:graphicData>
+                </a:graphic>
+                <wp14:sizeRelH relativeFrom="margin">
+                  <wp14:pctWidth>40000</wp14:pctWidth>
+                </wp14:sizeRelH>
+                <wp14:sizeRelV relativeFrom="margin">
+                  <wp14:pctHeight>20000</wp14:pctHeight>
+                </wp14:sizeRelV>
+              </wp:anchor>
+            </w:drawing>
+          </mc:Choice>
+          <mc:Fallback>
+            <w:pict>
+              <v:shape w14:anchorId="312722D3" id="Text Box 19" o:spid="_x0000_s1035" type="#_x0000_t202" style="position:absolute;margin-left:108.4pt;margin-top:27.15pt;width:185.9pt;height:110.6pt;z-index:251694080;visibility:visible;mso-wrap-style:square;mso-width-percent:400;mso-height-percent:200;mso-wrap-distance-left:9pt;mso-wrap-distance-top:3.6pt;mso-wrap-distance-right:9pt;mso-wrap-distance-bottom:3.6pt;mso-position-horizontal:absolute;mso-position-horizontal-relative:margin;mso-position-vertical:absolute;mso-position-vertical-relative:text;mso-width-percent:400;mso-height-percent:200;mso-width-relative:margin;mso-height-relative:margin;v-text-anchor:top" o:gfxdata="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">
+                <v:textbox style="mso-fit-shape-to-text:t">
+                  <w:txbxContent>
+                    <w:p>
+                      <w:r>
+                        <w:t>Step:0</w:t>
+                      </w:r>
+                      <w:r>
+                        <w:t>8</w:t>
+                      </w:r>
+                      <w:bookmarkStart w:id="1" w:name="_GoBack"/>
+                      <w:bookmarkEnd w:id="1"/>
+                    </w:p>
+                  </w:txbxContent>
+                </v:textbox>
+                <w10:wrap type="square" anchorx="margin"/>
+              </v:shape>
+            </w:pict>
+          </mc:Fallback>
+        </mc:AlternateContent>
+      </w:r>
+      <w:r>
+        <w:rPr>
+          <w:noProof/>
+        </w:rPr>
+        <mc:AlternateContent>
+          <mc:Choice Requires="wps">
+            <w:drawing>
+              <wp:anchor distT="0" distB="0" distL="114300" distR="114300" simplePos="0" relativeHeight="251673600" behindDoc="0" locked="0" layoutInCell="1" allowOverlap="1" wp14:anchorId="6A9543DA" wp14:editId="7B58FE46">
+                <wp:simplePos x="0" y="0"/>
+                <wp:positionH relativeFrom="margin">
+                  <wp:align>center</wp:align>
+                </wp:positionH>
+                <wp:positionV relativeFrom="paragraph">
+                  <wp:posOffset>1483360</wp:posOffset>
+                </wp:positionV>
+                <wp:extent cx="6606540" cy="2339340"/>
+                <wp:effectExtent l="0" t="0" r="22860" b="22860"/>
+                <wp:wrapNone/>
+                <wp:docPr id="16" name="Rounded Rectangle 16"/>
+                <wp:cNvGraphicFramePr/>
+                <a:graphic xmlns:a="http://schemas.openxmlformats.org/drawingml/2006/main">
+                  <a:graphicData uri="http://schemas.microsoft.com/office/word/2010/wordprocessingShape">
+                    <wps:wsp>
+                      <wps:cNvSpPr/>
+                      <wps:spPr>
+                        <a:xfrm>
+                          <a:off x="0" y="0"/>
+                          <a:ext cx="6606540" cy="2339340"/>
+                        </a:xfrm>
+                        <a:prstGeom prst="roundRect">
+                          <a:avLst/>
+                        </a:prstGeom>
+                        <a:blipFill>
+                          <a:blip r:embed="rId24"/>
+                          <a:stretch>
+                            <a:fillRect/>
+                          </a:stretch>
+                        </a:blipFill>
+                      </wps:spPr>
+                      <wps:style>
+                        <a:lnRef idx="2">
+                          <a:schemeClr val="accent1">
+                            <a:shade val="50000"/>
+                          </a:schemeClr>
+                        </a:lnRef>
+                        <a:fillRef idx="1">
+                          <a:schemeClr val="accent1"/>
+                        </a:fillRef>
+                        <a:effectRef idx="0">
+                          <a:schemeClr val="accent1"/>
+                        </a:effectRef>
+                        <a:fontRef idx="minor">
+                          <a:schemeClr val="lt1"/>
+                        </a:fontRef>
+                      </wps:style>
+                      <wps:bodyPr rot="0" spcFirstLastPara="0" vertOverflow="overflow" horzOverflow="overflow" vert="horz" wrap="square" lIns="91440" tIns="45720" rIns="91440" bIns="45720" numCol="1" spcCol="0" rtlCol="0" fromWordArt="0" anchor="ctr" anchorCtr="0" forceAA="0" compatLnSpc="1">
+                        <a:prstTxWarp prst="textNoShape">
+                          <a:avLst/>
+                        </a:prstTxWarp>
+                        <a:noAutofit/>
+                      </wps:bodyPr>
+                    </wps:wsp>
+                  </a:graphicData>
+                </a:graphic>
+                <wp14:sizeRelH relativeFrom="margin">
+                  <wp14:pctWidth>0</wp14:pctWidth>
+                </wp14:sizeRelH>
+                <wp14:sizeRelV relativeFrom="margin">
+                  <wp14:pctHeight>0</wp14:pctHeight>
+                </wp14:sizeRelV>
+              </wp:anchor>
+            </w:drawing>
+          </mc:Choice>
+          <mc:Fallback>
+            <w:pict>
+              <v:roundrect w14:anchorId="3D596566" id="Rounded Rectangle 16" o:spid="_x0000_s1026" style="position:absolute;margin-left:0;margin-top:116.8pt;width:520.2pt;height:184.2pt;z-index:251673600;visibility:visible;mso-wrap-style:square;mso-width-percent:0;mso-height-percent:0;mso-wrap-distance-left:9pt;mso-wrap-distance-top:0;mso-wrap-distance-right:9pt;mso-wrap-distance-bottom:0;mso-position-horizontal:center;mso-position-horizontal-relative:margin;mso-position-vertical:absolute;mso-position-vertical-relative:text;mso-width-percent:0;mso-height-percent:0;mso-width-relative:margin;mso-height-relative:margin;v-text-anchor:middle" arcsize="10923f" o:gfxdata="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" strokecolor="#1f4d78 [1604]" strokeweight="1pt">
+                <v:fill r:id="rId25" o:title="" recolor="t" rotate="t" type="frame"/>
+                <v:stroke joinstyle="miter"/>
+                <w10:wrap anchorx="margin"/>
+              </v:roundrect>
+            </w:pict>
+          </mc:Fallback>
+        </mc:AlternateContent>
+      </w:r>
+      <w:r>
+        <w:rPr>
+          <w:noProof/>
+        </w:rPr>
+        <mc:AlternateContent>
+          <mc:Choice Requires="wps">
+            <w:drawing>
+              <wp:anchor distT="45720" distB="45720" distL="114300" distR="114300" simplePos="0" relativeHeight="251695104" behindDoc="0" locked="0" layoutInCell="1" allowOverlap="1" wp14:anchorId="201FBBD7" wp14:editId="7C75FD0B">
+                <wp:simplePos x="0" y="0"/>
+                <wp:positionH relativeFrom="margin">
+                  <wp:posOffset>3469005</wp:posOffset>
+                </wp:positionH>
+                <wp:positionV relativeFrom="paragraph">
+                  <wp:posOffset>4886325</wp:posOffset>
+                </wp:positionV>
+                <wp:extent cx="2360930" cy="1404620"/>
+                <wp:effectExtent l="0" t="0" r="22860" b="13970"/>
+                <wp:wrapSquare wrapText="bothSides"/>
+                <wp:docPr id="20" name="Text Box 20"/>
+                <wp:cNvGraphicFramePr>
+                  <a:graphicFrameLocks xmlns:a="http://schemas.openxmlformats.org/drawingml/2006/main"/>
+                </wp:cNvGraphicFramePr>
+                <a:graphic xmlns:a="http://schemas.openxmlformats.org/drawingml/2006/main">
+                  <a:graphicData uri="http://schemas.microsoft.com/office/word/2010/wordprocessingShape">
+                    <wps:wsp>
+                      <wps:cNvSpPr txBox="1">
+                        <a:spLocks noChangeArrowheads="1"/>
+                      </wps:cNvSpPr>
+                      <wps:spPr bwMode="auto">
+                        <a:xfrm>
+                          <a:off x="0" y="0"/>
+                          <a:ext cx="2360930" cy="1404620"/>
+                        </a:xfrm>
+                        <a:prstGeom prst="rect">
+                          <a:avLst/>
+                        </a:prstGeom>
+                        <a:solidFill>
+                          <a:srgbClr val="FFFFFF"/>
+                        </a:solidFill>
+                        <a:ln w="9525">
+                          <a:solidFill>
+                            <a:srgbClr val="000000"/>
+                          </a:solidFill>
+                          <a:miter lim="800000"/>
+                          <a:headEnd/>
+                          <a:tailEnd/>
+                        </a:ln>
+                      </wps:spPr>
+                      <wps:txbx>
+                        <w:txbxContent>
+                          <w:p>
+                            <w:r>
+                              <w:t>Step:</w:t>
+                            </w:r>
+                            <w:r>
+                              <w:t>10</w:t>
+                            </w:r>
+                          </w:p>
+                        </w:txbxContent>
+                      </wps:txbx>
+                      <wps:bodyPr rot="0" vert="horz" wrap="square" lIns="91440" tIns="45720" rIns="91440" bIns="45720" anchor="t" anchorCtr="0">
+                        <a:spAutoFit/>
+                      </wps:bodyPr>
+                    </wps:wsp>
+                  </a:graphicData>
+                </a:graphic>
+                <wp14:sizeRelH relativeFrom="margin">
+                  <wp14:pctWidth>40000</wp14:pctWidth>
+                </wp14:sizeRelH>
+                <wp14:sizeRelV relativeFrom="margin">
+                  <wp14:pctHeight>20000</wp14:pctHeight>
+                </wp14:sizeRelV>
+              </wp:anchor>
+            </w:drawing>
+          </mc:Choice>
+          <mc:Fallback>
+            <w:pict>
+              <v:shape w14:anchorId="201FBBD7" id="Text Box 20" o:spid="_x0000_s1036" type="#_x0000_t202" style="position:absolute;margin-left:273.15pt;margin-top:384.75pt;width:185.9pt;height:110.6pt;z-index:251695104;visibility:visible;mso-wrap-style:square;mso-width-percent:400;mso-height-percent:200;mso-wrap-distance-left:9pt;mso-wrap-distance-top:3.6pt;mso-wrap-distance-right:9pt;mso-wrap-distance-bottom:3.6pt;mso-position-horizontal:absolute;mso-position-horizontal-relative:margin;mso-position-vertical:absolute;mso-position-vertical-relative:text;mso-width-percent:400;mso-height-percent:200;mso-width-relative:margin;mso-height-relative:margin;v-text-anchor:top" o:gfxdata="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">
+                <v:textbox style="mso-fit-shape-to-text:t">
+                  <w:txbxContent>
+                    <w:p>
+                      <w:r>
+                        <w:t>Step:</w:t>
+                      </w:r>
+                      <w:r>
+                        <w:t>10</w:t>
+                      </w:r>
+                    </w:p>
+                  </w:txbxContent>
+                </v:textbox>
+                <w10:wrap type="square" anchorx="margin"/>
+              </v:shape>
             </w:pict>
           </mc:Fallback>
         </mc:AlternateContent>

</xml_diff>